<commit_message>
Expand CV with all Mubogi projects (ClinicSync, JD Hub CBS, Kids AI Studio, Android Attendance, MT5 bot); update guide
</commit_message>
<xml_diff>
--- a/CV_Mubogi_Jordan.docx
+++ b/CV_Mubogi_Jordan.docx
@@ -96,7 +96,7 @@
                 <w:color w:val="1A1A1A"/>
                 <w:sz w:val="18"/>
               </w:rPr>
-              <w:t>Kampala, Uganda | +256 754 687 597 | +256 768 593 543 | mubogigastavasjordan@gmail.com | github.com/MAYI12333</w:t>
+              <w:t>Kampala, Uganda | +256 754 687 597 | +256 768 593 543 | mubogigastavasjordan@gmail.com | github.com/Mubogi</w:t>
             </w:r>
           </w:p>
         </w:tc>
@@ -130,7 +130,7 @@
         <w:spacing w:after="80"/>
       </w:pPr>
       <w:r>
-        <w:t>Results-driven ICT professional with a Bachelor of Science in Information Technology and wide experience across software development, teaching, sales, finance, media and leadership. I find real problems in Ugandan schools, SACCOs, SMEs and churches and turn them into working software - seven products designed, built and shipped so far, including a live marketplace that takes mobile-money payments. I am a self-taught multi-skilled creator: graphic design, content creation, video editing, church media and ICT training. I lead teams, plan events, manage money carefully, and I am equally comfortable in front of a class, a client or a camera. I am open to any role - part-time or full-time - and I work well under pressure.</w:t>
+        <w:t>Results-driven ICT professional with a Bachelor of Science in Information Technology and wide experience across software development, teaching, sales, finance, media and leadership. I have designed, built and shipped over a dozen working software products for Ugandan schools, SACCOs, clinics, SMEs and churches - including live marketplaces, banking and clinic systems, mobile apps and a generative-AI kids' studio. I am a self-taught multi-skilled creator: graphic design, content creation, video editing, church media and ICT training. I lead teams, plan events, manage money carefully, and I am equally comfortable in front of a class, a client or a camera. I am open to any role - part-time or full-time - and I work well under pressure.</w:t>
       </w:r>
     </w:p>
     <w:p>
@@ -250,7 +250,22 @@
         <w:t xml:space="preserve">Software &amp; Web Development: </w:t>
       </w:r>
       <w:r>
-        <w:t>Python, Django 5, Flask, SQLAlchemy, JavaScript, Node.js, Express, Socket.IO, SQL (SQLite &amp; PostgreSQL), REST APIs, HTML5, CSS3, Bootstrap 5, Tailwind CSS, Alpine.js, Jinja2, PWA, Flutter (Dart)</w:t>
+        <w:t>Python, Django 5, Flask, SQLAlchemy, JavaScript, TypeScript, React 18, Node.js, Express, Socket.IO, GraphQL/Apollo, SQL (SQLite &amp; PostgreSQL), REST APIs, HTML5, CSS3, Bootstrap 5, Tailwind CSS, Alpine.js, MUI, Jinja2, PWA</w:t>
+      </w:r>
+    </w:p>
+    <w:p>
+      <w:pPr>
+        <w:pStyle w:val="ListBullet"/>
+        <w:spacing w:after="40"/>
+      </w:pPr>
+      <w:r>
+        <w:rPr>
+          <w:b/>
+        </w:rPr>
+        <w:t xml:space="preserve">Mobile &amp; Desktop: </w:t>
+      </w:r>
+      <w:r>
+        <w:t>Flutter (Dart), Kotlin (native Android, Room), Capacitor, PyInstaller (Windows EXE), offline-first sync (PouchDB / IndexedDB), LAN device linking</w:t>
       </w:r>
     </w:p>
     <w:p>
@@ -265,7 +280,22 @@
         <w:t xml:space="preserve">AI &amp; Automation: </w:t>
       </w:r>
       <w:r>
-        <w:t>AI-assisted development with OpenHands, learning to design and build AI agents, prompt engineering, automating content and document generation (ReportLab PDFs)</w:t>
+        <w:t>AI-assisted development with OpenHands, learning to design and build AI agents, prompt engineering, open-source generative AI (text-to-video, image-to-video), ML basics (scikit-learn), automating content and document generation (ReportLab PDFs)</w:t>
+      </w:r>
+    </w:p>
+    <w:p>
+      <w:pPr>
+        <w:pStyle w:val="ListBullet"/>
+        <w:spacing w:after="40"/>
+      </w:pPr>
+      <w:r>
+        <w:rPr>
+          <w:b/>
+        </w:rPr>
+        <w:t xml:space="preserve">Data &amp; Backend Systems: </w:t>
+      </w:r>
+      <w:r>
+        <w:t>Database design, Prisma, migrations, authentication, role-based access control, audit logging, webhooks, mobile-money payments (Flutterwave / MTN MoMo / Airtel)</w:t>
       </w:r>
     </w:p>
     <w:p>
@@ -295,7 +325,7 @@
         <w:t xml:space="preserve">IT &amp; Technical Support: </w:t>
       </w:r>
       <w:r>
-        <w:t>ICT training and teaching, computer literacy, web design, networking basics, software installation, troubleshooting, Git &amp; GitHub, cloud deployment (Render), Linux command line</w:t>
+        <w:t>ICT training and teaching, computer literacy, web design, networking basics, software installation, troubleshooting, Git &amp; GitHub, GitHub Actions, cloud deployment (Render), Linux command line</w:t>
       </w:r>
     </w:p>
     <w:p>
@@ -455,7 +485,7 @@
         <w:spacing w:after="40"/>
       </w:pPr>
       <w:r>
-        <w:t>Founded and run Jordan Design Hub, delivering web and mobile apps, an online academy, ICT consultancy and media services to schools, SACCOs, SMEs and churches in Uganda.</w:t>
+        <w:t>Founded and run Jordan Design Hub, delivering web and mobile apps, an online academy, ICT consultancy and media services to schools, SACCOs, clinics, SMEs and churches in Uganda.</w:t>
       </w:r>
     </w:p>
     <w:p>
@@ -464,7 +494,7 @@
         <w:spacing w:after="40"/>
       </w:pPr>
       <w:r>
-        <w:t>Took seven products from idea to a working, deployed state: JD Hub, MyMarket.ug, BizDocs, KJ, UCSCU Connect, Attendance Hub and the Offline-First School Management System.</w:t>
+        <w:t>Took more than a dozen products from idea to a working, deployed state - web platforms, mobile apps, desktop software and AI tools (full list under Key Projects).</w:t>
       </w:r>
     </w:p>
     <w:p>
@@ -842,6 +872,102 @@
           <w:b/>
           <w:sz w:val="21"/>
         </w:rPr>
+        <w:t>ClinicSync - Clinic, Pharmacy &amp; Drug-Shop System (live, Android + Windows + Linux)</w:t>
+      </w:r>
+    </w:p>
+    <w:p>
+      <w:pPr>
+        <w:pStyle w:val="ListBullet"/>
+        <w:spacing w:after="40"/>
+      </w:pPr>
+      <w:r>
+        <w:t>An offline-first hospital, clinic and drug-shop system for low-resource settings: all reads and writes hit the local database first and sync to the cloud when the network returns.</w:t>
+      </w:r>
+    </w:p>
+    <w:p>
+      <w:pPr>
+        <w:pStyle w:val="ListBullet"/>
+        <w:spacing w:after="40"/>
+      </w:pPr>
+      <w:r>
+        <w:t>Point-of-sale with fast drug search, selling by tablet / strip / box, printable 80 mm thermal receipts; daily expenses; and a one-click end-of-day balance sheet with MTN/Airtel mobile-money reconciliation.</w:t>
+      </w:r>
+    </w:p>
+    <w:p>
+      <w:pPr>
+        <w:pStyle w:val="ListBullet"/>
+        <w:spacing w:after="40"/>
+      </w:pPr>
+      <w:r>
+        <w:t>Inventory with FEFO (first-expire-first-out) batch expiry and reorder levels; tiered SaaS plans (Basic / Premium / Pro).</w:t>
+      </w:r>
+    </w:p>
+    <w:p>
+      <w:pPr>
+        <w:pStyle w:val="ListBullet"/>
+        <w:spacing w:after="40"/>
+      </w:pPr>
+      <w:r>
+        <w:t>Shipped installers for Android (APK), Windows (EXE) and Linux (AppImage / .deb), with device-bound activation licensing.</w:t>
+      </w:r>
+    </w:p>
+    <w:p>
+      <w:pPr>
+        <w:pStyle w:val="ListBullet"/>
+        <w:spacing w:after="40"/>
+      </w:pPr>
+      <w:r>
+        <w:t>Built with React/Vite, Tailwind, Express, Prisma and PouchDB.</w:t>
+      </w:r>
+    </w:p>
+    <w:p>
+      <w:pPr>
+        <w:spacing w:before="100" w:after="20"/>
+      </w:pPr>
+      <w:r>
+        <w:rPr>
+          <w:b/>
+          <w:sz w:val="21"/>
+        </w:rPr>
+        <w:t>JD Hub CBS - Co-operative Banking System for SACCOs (prototype)</w:t>
+      </w:r>
+    </w:p>
+    <w:p>
+      <w:pPr>
+        <w:pStyle w:val="ListBullet"/>
+        <w:spacing w:after="40"/>
+      </w:pPr>
+      <w:r>
+        <w:t>A modern core-banking system for SACCOs and credit unions, re-branded from a UCSCU CBS client.</w:t>
+      </w:r>
+    </w:p>
+    <w:p>
+      <w:pPr>
+        <w:pStyle w:val="ListBullet"/>
+        <w:spacing w:after="40"/>
+      </w:pPr>
+      <w:r>
+        <w:t>Multi-user demo hub that gives each user an isolated instance behind a reverse proxy (JupyterHub-style).</w:t>
+      </w:r>
+    </w:p>
+    <w:p>
+      <w:pPr>
+        <w:pStyle w:val="ListBullet"/>
+        <w:spacing w:after="40"/>
+      </w:pPr>
+      <w:r>
+        <w:t>Built with React 18, TypeScript, MUI, Apollo GraphQL and a mock GraphQL backend.</w:t>
+      </w:r>
+    </w:p>
+    <w:p>
+      <w:pPr>
+        <w:spacing w:before="100" w:after="20"/>
+      </w:pPr>
+      <w:r>
+        <w:rPr>
+          <w:b/>
+          <w:sz w:val="21"/>
+        </w:rPr>
         <w:t>MyMarket.ug - Multi-Vendor Marketplace (live)</w:t>
       </w:r>
     </w:p>
@@ -920,45 +1046,6 @@
           <w:b/>
           <w:sz w:val="21"/>
         </w:rPr>
-        <w:t>JD Hub - Company Website &amp; Platform (live)</w:t>
-      </w:r>
-    </w:p>
-    <w:p>
-      <w:pPr>
-        <w:pStyle w:val="ListBullet"/>
-        <w:spacing w:after="40"/>
-      </w:pPr>
-      <w:r>
-        <w:t>The public site for Jordan Design Hub: systems showcase, academy catalogue, services, design gallery and WhatsApp lead capture.</w:t>
-      </w:r>
-    </w:p>
-    <w:p>
-      <w:pPr>
-        <w:pStyle w:val="ListBullet"/>
-        <w:spacing w:after="40"/>
-      </w:pPr>
-      <w:r>
-        <w:t>Includes a simple shop with mobile-money payment and a secure 48-hour download link after approval.</w:t>
-      </w:r>
-    </w:p>
-    <w:p>
-      <w:pPr>
-        <w:pStyle w:val="ListBullet"/>
-        <w:spacing w:after="40"/>
-      </w:pPr>
-      <w:r>
-        <w:t>Built with Django 5 and Bootstrap 5; deployed on Render.</w:t>
-      </w:r>
-    </w:p>
-    <w:p>
-      <w:pPr>
-        <w:spacing w:before="100" w:after="20"/>
-      </w:pPr>
-      <w:r>
-        <w:rPr>
-          <w:b/>
-          <w:sz w:val="21"/>
-        </w:rPr>
         <w:t>UCSCU Connect - SACCO Apex Platform (in progress)</w:t>
       </w:r>
     </w:p>
@@ -978,36 +1065,6 @@
       </w:pPr>
       <w:r>
         <w:t>Built with Python, Flask and SQLAlchemy.</w:t>
-      </w:r>
-    </w:p>
-    <w:p>
-      <w:pPr>
-        <w:spacing w:before="100" w:after="20"/>
-      </w:pPr>
-      <w:r>
-        <w:rPr>
-          <w:b/>
-          <w:sz w:val="21"/>
-        </w:rPr>
-        <w:t>Attendance Hub - Church &amp; Event Check-in (in use)</w:t>
-      </w:r>
-    </w:p>
-    <w:p>
-      <w:pPr>
-        <w:pStyle w:val="ListBullet"/>
-        <w:spacing w:after="40"/>
-      </w:pPr>
-      <w:r>
-        <w:t>A check-in system for churches and events on a single Windows computer, with member registration, reports and Excel export.</w:t>
-      </w:r>
-    </w:p>
-    <w:p>
-      <w:pPr>
-        <w:pStyle w:val="ListBullet"/>
-        <w:spacing w:after="40"/>
-      </w:pPr>
-      <w:r>
-        <w:t>Built with Django and packaged as a Windows app so it works offline at the door.</w:t>
       </w:r>
     </w:p>
     <w:p>
@@ -1028,7 +1085,7 @@
         <w:spacing w:after="40"/>
       </w:pPr>
       <w:r>
-        <w:t>Covers students, teachers, fees, marks and reports, and works without internet; licensed per school and tied to the computer.</w:t>
+        <w:t>Covers students, teachers, fees, marks and reports, works without internet, and uses 9 role-based access levels; licensed per school and tied to the computer (HWID).</w:t>
       </w:r>
     </w:p>
     <w:p>
@@ -1037,7 +1094,202 @@
         <w:spacing w:after="40"/>
       </w:pPr>
       <w:r>
+        <w:t>Includes a QR parent kiosk and a multi-tenant cloud hub for sync, licensing and backups.</w:t>
+      </w:r>
+    </w:p>
+    <w:p>
+      <w:pPr>
+        <w:pStyle w:val="ListBullet"/>
+        <w:spacing w:after="40"/>
+      </w:pPr>
+      <w:r>
         <w:t>Built with Django as an installable desktop application.</w:t>
+      </w:r>
+    </w:p>
+    <w:p>
+      <w:pPr>
+        <w:spacing w:before="100" w:after="20"/>
+      </w:pPr>
+      <w:r>
+        <w:rPr>
+          <w:b/>
+          <w:sz w:val="21"/>
+        </w:rPr>
+        <w:t>Attendance Hub - Church &amp; Event Check-in (web + native Android)</w:t>
+      </w:r>
+    </w:p>
+    <w:p>
+      <w:pPr>
+        <w:pStyle w:val="ListBullet"/>
+        <w:spacing w:after="40"/>
+      </w:pPr>
+      <w:r>
+        <w:t>A check-in system for churches and events with member registration, reports and Excel export; the native Android version needs no server or internet at all.</w:t>
+      </w:r>
+    </w:p>
+    <w:p>
+      <w:pPr>
+        <w:pStyle w:val="ListBullet"/>
+        <w:spacing w:after="40"/>
+      </w:pPr>
+      <w:r>
+        <w:t>The Android app adds LAN device linking so several phones on the same Wi-Fi share attendance in real time, plus activation keys and PDF reports.</w:t>
+      </w:r>
+    </w:p>
+    <w:p>
+      <w:pPr>
+        <w:pStyle w:val="ListBullet"/>
+        <w:spacing w:after="40"/>
+      </w:pPr>
+      <w:r>
+        <w:t>Built with Django (web) and Kotlin + Room + NanoHTTPD (Android).</w:t>
+      </w:r>
+    </w:p>
+    <w:p>
+      <w:pPr>
+        <w:spacing w:before="100" w:after="20"/>
+      </w:pPr>
+      <w:r>
+        <w:rPr>
+          <w:b/>
+          <w:sz w:val="21"/>
+        </w:rPr>
+        <w:t>Kids AI Studio - Generative-AI Kids' Video Maker (open source)</w:t>
+      </w:r>
+    </w:p>
+    <w:p>
+      <w:pPr>
+        <w:pStyle w:val="ListBullet"/>
+        <w:spacing w:after="40"/>
+      </w:pPr>
+      <w:r>
+        <w:t>Turns one sentence into a finished animated kids' story video or sing-along song, using open-source generative AI models on a free Kaggle GPU.</w:t>
+      </w:r>
+    </w:p>
+    <w:p>
+      <w:pPr>
+        <w:pStyle w:val="ListBullet"/>
+        <w:spacing w:after="40"/>
+      </w:pPr>
+      <w:r>
+        <w:t>Generates scenes, music, narration and captions into a finished MP4, with an image-to-video mode for personal pictures.</w:t>
+      </w:r>
+    </w:p>
+    <w:p>
+      <w:pPr>
+        <w:pStyle w:val="ListBullet"/>
+        <w:spacing w:after="40"/>
+      </w:pPr>
+      <w:r>
+        <w:t>Built in Python with ffmpeg and text-to-video / image-to-video models.</w:t>
+      </w:r>
+    </w:p>
+    <w:p>
+      <w:pPr>
+        <w:spacing w:before="100" w:after="20"/>
+      </w:pPr>
+      <w:r>
+        <w:rPr>
+          <w:b/>
+          <w:sz w:val="21"/>
+        </w:rPr>
+        <w:t>MT5 Algorithmic Trading Bot (open source)</w:t>
+      </w:r>
+    </w:p>
+    <w:p>
+      <w:pPr>
+        <w:pStyle w:val="ListBullet"/>
+        <w:spacing w:after="40"/>
+      </w:pPr>
+      <w:r>
+        <w:t>A discipline-first MetaTrader 5 bot with ML signal generation (RandomForest), a 0.01-lot cap, a $10 daily circuit breaker, an 80/20 profit vault and Discord remote control.</w:t>
+      </w:r>
+    </w:p>
+    <w:p>
+      <w:pPr>
+        <w:pStyle w:val="ListBullet"/>
+        <w:spacing w:after="40"/>
+      </w:pPr>
+      <w:r>
+        <w:t>Includes a vectorized backtester with walk-forward out-of-sample validation and per-strategy kill switches.</w:t>
+      </w:r>
+    </w:p>
+    <w:p>
+      <w:pPr>
+        <w:pStyle w:val="ListBullet"/>
+        <w:spacing w:after="40"/>
+      </w:pPr>
+      <w:r>
+        <w:t>Built in Python (scikit-learn, MT5 API).</w:t>
+      </w:r>
+    </w:p>
+    <w:p>
+      <w:pPr>
+        <w:spacing w:before="100" w:after="20"/>
+      </w:pPr>
+      <w:r>
+        <w:rPr>
+          <w:b/>
+          <w:sz w:val="21"/>
+        </w:rPr>
+        <w:t>Savings Bank SACCO App (recovered &amp; improved)</w:t>
+      </w:r>
+    </w:p>
+    <w:p>
+      <w:pPr>
+        <w:pStyle w:val="ListBullet"/>
+        <w:spacing w:after="40"/>
+      </w:pPr>
+      <w:r>
+        <w:t>A Flutter savings-and-credit app for SACCO members, recovered and improved from an earlier build.</w:t>
+      </w:r>
+    </w:p>
+    <w:p>
+      <w:pPr>
+        <w:pStyle w:val="ListBullet"/>
+        <w:spacing w:after="40"/>
+      </w:pPr>
+      <w:r>
+        <w:t>Built with Flutter (Dart).</w:t>
+      </w:r>
+    </w:p>
+    <w:p>
+      <w:pPr>
+        <w:spacing w:before="100" w:after="20"/>
+      </w:pPr>
+      <w:r>
+        <w:rPr>
+          <w:b/>
+          <w:sz w:val="21"/>
+        </w:rPr>
+        <w:t>JD Hub - Company Website &amp; Platform (live)</w:t>
+      </w:r>
+    </w:p>
+    <w:p>
+      <w:pPr>
+        <w:pStyle w:val="ListBullet"/>
+        <w:spacing w:after="40"/>
+      </w:pPr>
+      <w:r>
+        <w:t>The public site for Jordan Design Hub: systems showcase, academy catalogue, services, design gallery and WhatsApp lead capture.</w:t>
+      </w:r>
+    </w:p>
+    <w:p>
+      <w:pPr>
+        <w:pStyle w:val="ListBullet"/>
+        <w:spacing w:after="40"/>
+      </w:pPr>
+      <w:r>
+        <w:t>Includes a simple shop with mobile-money payment and a secure 48-hour download link after approval.</w:t>
+      </w:r>
+    </w:p>
+    <w:p>
+      <w:pPr>
+        <w:pStyle w:val="ListBullet"/>
+        <w:spacing w:after="40"/>
+      </w:pPr>
+      <w:r>
+        <w:t>Built with Django 5 and Bootstrap 5; deployed on Render.</w:t>
       </w:r>
     </w:p>
     <w:p>
@@ -1277,7 +1529,16 @@
         <w:spacing w:after="40"/>
       </w:pPr>
       <w:r>
-        <w:t>Web and software development, learned largely by building real projects</w:t>
+        <w:t>Generative AI for media - text-to-video and image-to-video</w:t>
+      </w:r>
+    </w:p>
+    <w:p>
+      <w:pPr>
+        <w:pStyle w:val="ListBullet"/>
+        <w:spacing w:after="40"/>
+      </w:pPr>
+      <w:r>
+        <w:t>Web, mobile and desktop development, learned largely by building real projects</w:t>
       </w:r>
     </w:p>
     <w:p>

</xml_diff>

<commit_message>
Rewrite CV: honest, general-purpose, simple English, better design; fix UCSCU and project status
</commit_message>
<xml_diff>
--- a/CV_Mubogi_Jordan.docx
+++ b/CV_Mubogi_Jordan.docx
@@ -9,13 +9,14 @@
         <w:tblLook w:firstColumn="1" w:firstRow="1" w:lastColumn="0" w:lastRow="0" w:noHBand="0" w:noVBand="1" w:val="04A0"/>
       </w:tblPr>
       <w:tblGrid>
-        <w:gridCol w:w="1944"/>
+        <w:gridCol w:w="2016"/>
         <w:gridCol w:w="8496"/>
       </w:tblGrid>
       <w:tr>
         <w:tc>
           <w:tcPr>
-            <w:tcW w:type="dxa" w:w="5256"/>
+            <w:tcW w:type="dxa" w:w="5328"/>
+            <w:shd w:val="clear" w:color="auto" w:fill="0B3D91"/>
           </w:tcPr>
           <w:p>
             <w:pPr>
@@ -25,7 +26,7 @@
             <w:r>
               <w:drawing>
                 <wp:inline xmlns:a="http://schemas.openxmlformats.org/drawingml/2006/main" xmlns:pic="http://schemas.openxmlformats.org/drawingml/2006/picture">
-                  <wp:extent cx="1143000" cy="1469571"/>
+                  <wp:extent cx="1097280" cy="1410789"/>
                   <wp:docPr id="1" name="Picture 1"/>
                   <wp:cNvGraphicFramePr>
                     <a:graphicFrameLocks noChangeAspect="1"/>
@@ -46,7 +47,7 @@
                         <pic:spPr>
                           <a:xfrm>
                             <a:off x="0" y="0"/>
-                            <a:ext cx="1143000" cy="1469571"/>
+                            <a:ext cx="1097280" cy="1410789"/>
                           </a:xfrm>
                           <a:prstGeom prst="rect"/>
                         </pic:spPr>
@@ -60,7 +61,8 @@
         </w:tc>
         <w:tc>
           <w:tcPr>
-            <w:tcW w:type="dxa" w:w="5256"/>
+            <w:tcW w:type="dxa" w:w="5328"/>
+            <w:shd w:val="clear" w:color="auto" w:fill="0B3D91"/>
           </w:tcPr>
           <w:p>
             <w:pPr>
@@ -69,22 +71,22 @@
             <w:r>
               <w:rPr>
                 <w:b/>
-                <w:color w:val="0B3D91"/>
-                <w:sz w:val="40"/>
+                <w:color w:val="FFFFFF"/>
+                <w:sz w:val="38"/>
               </w:rPr>
               <w:t>MUBOGI GASTAVAS JORDAN</w:t>
             </w:r>
           </w:p>
           <w:p>
             <w:pPr>
-              <w:spacing w:after="20"/>
+              <w:spacing w:after="40"/>
             </w:pPr>
             <w:r>
               <w:rPr>
-                <w:color w:val="555555"/>
-                <w:sz w:val="21"/>
+                <w:color w:val="CFE0FF"/>
+                <w:sz w:val="19"/>
               </w:rPr>
-              <w:t>ICT Professional  |  Full-Stack Developer  |  Educator, Leader &amp; Creative</w:t>
+              <w:t>ICT &amp; Computer Skills  ·  Teaching  ·  Sales &amp; Customer Care  ·  Media &amp; Design</w:t>
             </w:r>
           </w:p>
           <w:p>
@@ -93,8 +95,8 @@
             </w:pPr>
             <w:r>
               <w:rPr>
-                <w:color w:val="1A1A1A"/>
-                <w:sz w:val="18"/>
+                <w:color w:val="FFFFFF"/>
+                <w:sz w:val="17"/>
               </w:rPr>
               <w:t>Kampala, Uganda | +256 754 687 597 | +256 768 593 543 | mubogigastavasjordan@gmail.com | github.com/Mubogi</w:t>
             </w:r>
@@ -104,25 +106,17 @@
     </w:tbl>
     <w:p>
       <w:pPr>
-        <w:spacing w:before="0" w:after="120"/>
-        <w:pBdr>
-          <w:bottom w:val="single" w:sz="8" w:space="1" w:color="0B3D91"/>
-        </w:pBdr>
-      </w:pPr>
-    </w:p>
-    <w:p>
-      <w:pPr>
-        <w:spacing w:before="220" w:after="60"/>
-        <w:ind w:left="80"/>
-        <w:shd w:val="clear" w:color="auto" w:fill="E8EEF9"/>
+        <w:spacing w:before="200" w:after="80"/>
+        <w:ind w:left="0"/>
+        <w:shd w:val="clear" w:color="auto" w:fill="0B3D91"/>
       </w:pPr>
       <w:r>
         <w:rPr>
           <w:b/>
-          <w:color w:val="0B3D91"/>
-          <w:sz w:val="22"/>
+          <w:color w:val="FFFFFF"/>
+          <w:sz w:val="21"/>
         </w:rPr>
-        <w:t xml:space="preserve">  PROFESSIONAL SUMMARY</w:t>
+        <w:t xml:space="preserve">  ABOUT ME</w:t>
       </w:r>
     </w:p>
     <w:p>
@@ -130,22 +124,22 @@
         <w:spacing w:after="80"/>
       </w:pPr>
       <w:r>
-        <w:t>Results-driven ICT professional with a Bachelor of Science in Information Technology and wide experience across software development, teaching, sales, finance, media and leadership. I have designed, built and shipped over a dozen working software products for Ugandan schools, SACCOs, clinics, SMEs and churches - including live marketplaces, banking and clinic systems, mobile apps and a generative-AI kids' studio. I am a self-taught multi-skilled creator: graphic design, content creation, video editing, church media and ICT training. I lead teams, plan events, manage money carefully, and I am equally comfortable in front of a class, a client or a camera. I am open to any role - part-time or full-time - and I work well under pressure.</w:t>
+        <w:t>I am an ICT professional from Kampala with a degree in Information Technology. I have worked in teaching, sales, customer care, finance and media, and I also build websites and simple apps. I learn new things quickly, I am honest and hardworking, and I work well with people and under pressure. I am ready to do any job I am given and to give it my best.</w:t>
       </w:r>
     </w:p>
     <w:p>
       <w:pPr>
-        <w:spacing w:before="220" w:after="60"/>
-        <w:ind w:left="80"/>
-        <w:shd w:val="clear" w:color="auto" w:fill="E8EEF9"/>
+        <w:spacing w:before="200" w:after="80"/>
+        <w:ind w:left="0"/>
+        <w:shd w:val="clear" w:color="auto" w:fill="0B3D91"/>
       </w:pPr>
       <w:r>
         <w:rPr>
           <w:b/>
-          <w:color w:val="0B3D91"/>
-          <w:sz w:val="22"/>
+          <w:color w:val="FFFFFF"/>
+          <w:sz w:val="21"/>
         </w:rPr>
-        <w:t xml:space="preserve">  PROFILE</w:t>
+        <w:t xml:space="preserve">  QUICK FACTS</w:t>
       </w:r>
     </w:p>
     <w:p>
@@ -157,10 +151,10 @@
         <w:rPr>
           <w:b/>
         </w:rPr>
-        <w:t xml:space="preserve">Role I want: </w:t>
+        <w:t xml:space="preserve">What I am looking for: </w:t>
       </w:r>
       <w:r>
-        <w:t>Any lucrative ICT, software, teaching, sales, media or administrative role</w:t>
+        <w:t>Any job I can do well - ICT, teaching, sales, customer care, media or office work</w:t>
       </w:r>
     </w:p>
     <w:p>
@@ -175,7 +169,7 @@
         <w:t xml:space="preserve">Availability: </w:t>
       </w:r>
       <w:r>
-        <w:t>Full-time or part-time; short-term contracts welcome; works well under pressure</w:t>
+        <w:t>Full-time or part-time; ready to start anytime; can work under pressure</w:t>
       </w:r>
     </w:p>
     <w:p>
@@ -190,7 +184,7 @@
         <w:t xml:space="preserve">Location: </w:t>
       </w:r>
       <w:r>
-        <w:t>Kampala, Uganda (open to remote and travel)</w:t>
+        <w:t>Kampala, Uganda (ready to travel)</w:t>
       </w:r>
     </w:p>
     <w:p>
@@ -205,7 +199,7 @@
         <w:t xml:space="preserve">Currently: </w:t>
       </w:r>
       <w:r>
-        <w:t>ICT Volunteer at UCSCU; studying a Certificate in Theology; learning AI agents</w:t>
+        <w:t>Volunteering at UCSCU; studying a Certificate in Theology</w:t>
       </w:r>
     </w:p>
     <w:p>
@@ -217,25 +211,25 @@
         <w:rPr>
           <w:b/>
         </w:rPr>
-        <w:t xml:space="preserve">Next goal: </w:t>
+        <w:t xml:space="preserve">Goal: </w:t>
       </w:r>
       <w:r>
-        <w:t>Enrolling for a Master's in IT / Software Engineering</w:t>
+        <w:t>To keep learning and grow into a bigger role</w:t>
       </w:r>
     </w:p>
     <w:p>
       <w:pPr>
-        <w:spacing w:before="220" w:after="60"/>
-        <w:ind w:left="80"/>
-        <w:shd w:val="clear" w:color="auto" w:fill="E8EEF9"/>
+        <w:spacing w:before="200" w:after="80"/>
+        <w:ind w:left="0"/>
+        <w:shd w:val="clear" w:color="auto" w:fill="0B3D91"/>
       </w:pPr>
       <w:r>
         <w:rPr>
           <w:b/>
-          <w:color w:val="0B3D91"/>
-          <w:sz w:val="22"/>
+          <w:color w:val="FFFFFF"/>
+          <w:sz w:val="21"/>
         </w:rPr>
-        <w:t xml:space="preserve">  CORE SKILLS</w:t>
+        <w:t xml:space="preserve">  SKILLS</w:t>
       </w:r>
     </w:p>
     <w:p>
@@ -247,10 +241,10 @@
         <w:rPr>
           <w:b/>
         </w:rPr>
-        <w:t xml:space="preserve">Software &amp; Web Development: </w:t>
+        <w:t xml:space="preserve">ICT &amp; Computer Skills: </w:t>
       </w:r>
       <w:r>
-        <w:t>Python, Django 5, Flask, SQLAlchemy, JavaScript, TypeScript, React 18, Node.js, Express, Socket.IO, GraphQL/Apollo, SQL (SQLite &amp; PostgreSQL), REST APIs, HTML5, CSS3, Bootstrap 5, Tailwind CSS, Alpine.js, MUI, Jinja2, PWA</w:t>
+        <w:t>Using and setting up computers, Microsoft Office (Word, Excel, PowerPoint), internet and email, fixing simple computer problems, teaching computer skills to others</w:t>
       </w:r>
     </w:p>
     <w:p>
@@ -262,10 +256,10 @@
         <w:rPr>
           <w:b/>
         </w:rPr>
-        <w:t xml:space="preserve">Mobile &amp; Desktop: </w:t>
+        <w:t xml:space="preserve">Websites &amp; Apps: </w:t>
       </w:r>
       <w:r>
-        <w:t>Flutter (Dart), Kotlin (native Android, Room), Capacitor, PyInstaller (Windows EXE), offline-first sync (PouchDB / IndexedDB), LAN device linking</w:t>
+        <w:t>I can build websites and simple apps using Python, Django, Flask, JavaScript, HTML, CSS, Flutter and Node.js, with help from AI tools such as OpenHands. I understand how they work, and I test and set them up myself.</w:t>
       </w:r>
     </w:p>
     <w:p>
@@ -277,10 +271,10 @@
         <w:rPr>
           <w:b/>
         </w:rPr>
-        <w:t xml:space="preserve">AI &amp; Automation: </w:t>
+        <w:t xml:space="preserve">Design &amp; Media: </w:t>
       </w:r>
       <w:r>
-        <w:t>AI-assisted development with OpenHands, learning to design and build AI agents, prompt engineering, open-source generative AI (text-to-video, image-to-video), ML basics (scikit-learn), automating content and document generation (ReportLab PDFs)</w:t>
+        <w:t>Graphic design (Canva), making posters and logos, editing videos, content creation, running sound and media for church services and events, livestreaming</w:t>
       </w:r>
     </w:p>
     <w:p>
@@ -292,10 +286,10 @@
         <w:rPr>
           <w:b/>
         </w:rPr>
-        <w:t xml:space="preserve">Data &amp; Backend Systems: </w:t>
+        <w:t xml:space="preserve">Sales &amp; Customer Care: </w:t>
       </w:r>
       <w:r>
-        <w:t>Database design, Prisma, migrations, authentication, role-based access control, audit logging, webhooks, mobile-money payments (Flutterwave / MTN MoMo / Airtel)</w:t>
+        <w:t>Direct sales, marketing, talking to customers, following up with clients, building good relationships with people</w:t>
       </w:r>
     </w:p>
     <w:p>
@@ -307,10 +301,10 @@
         <w:rPr>
           <w:b/>
         </w:rPr>
-        <w:t xml:space="preserve">Creative &amp; Media: </w:t>
+        <w:t xml:space="preserve">Money &amp; Records: </w:t>
       </w:r>
       <w:r>
-        <w:t>Graphic design (Canva, InShot), content creation, video editing, church media and sound systems, livestreaming (OBS / OpenLP), branding and promotional materials</w:t>
+        <w:t>Budgeting, keeping records, assessing loans, managing small funds, organising work</w:t>
       </w:r>
     </w:p>
     <w:p>
@@ -322,53 +316,23 @@
         <w:rPr>
           <w:b/>
         </w:rPr>
-        <w:t xml:space="preserve">IT &amp; Technical Support: </w:t>
+        <w:t xml:space="preserve">Leadership &amp; People: </w:t>
       </w:r>
       <w:r>
-        <w:t>ICT training and teaching, computer literacy, web design, networking basics, software installation, troubleshooting, Git &amp; GitHub, GitHub Actions, cloud deployment (Render), Linux command line</w:t>
+        <w:t>Leading small teams, planning events, public speaking, teaching and mentoring others, working with different kinds of people</w:t>
       </w:r>
     </w:p>
     <w:p>
       <w:pPr>
-        <w:pStyle w:val="ListBullet"/>
-        <w:spacing w:after="40"/>
+        <w:spacing w:before="200" w:after="80"/>
+        <w:ind w:left="0"/>
+        <w:shd w:val="clear" w:color="auto" w:fill="0B3D91"/>
       </w:pPr>
       <w:r>
         <w:rPr>
           <w:b/>
-        </w:rPr>
-        <w:t xml:space="preserve">Finance &amp; Organisational Strategy: </w:t>
-      </w:r>
-      <w:r>
-        <w:t>Budgeting, credit assessment, financial management, workflow optimisation, record keeping, project planning</w:t>
-      </w:r>
-    </w:p>
-    <w:p>
-      <w:pPr>
-        <w:pStyle w:val="ListBullet"/>
-        <w:spacing w:after="40"/>
-      </w:pPr>
-      <w:r>
-        <w:rPr>
-          <w:b/>
-        </w:rPr>
-        <w:t xml:space="preserve">Leadership &amp; Communication: </w:t>
-      </w:r>
-      <w:r>
-        <w:t>Team mentorship, initiative coordination, event planning, public speaking, client relations, translation services, digital branding and campaign strategies</w:t>
-      </w:r>
-    </w:p>
-    <w:p>
-      <w:pPr>
-        <w:spacing w:before="220" w:after="60"/>
-        <w:ind w:left="80"/>
-        <w:shd w:val="clear" w:color="auto" w:fill="E8EEF9"/>
-      </w:pPr>
-      <w:r>
-        <w:rPr>
-          <w:b/>
-          <w:color w:val="0B3D91"/>
-          <w:sz w:val="22"/>
+          <w:color w:val="FFFFFF"/>
+          <w:sz w:val="21"/>
         </w:rPr>
         <w:t xml:space="preserve">  WORK EXPERIENCE</w:t>
       </w:r>
@@ -394,7 +358,7 @@
         <w:rPr>
           <w:i/>
           <w:color w:val="555555"/>
-          <w:sz w:val="19"/>
+          <w:sz w:val="18"/>
         </w:rPr>
         <w:t>Kampala, Uganda  |  2026 - Present</w:t>
       </w:r>
@@ -405,7 +369,7 @@
         <w:spacing w:after="40"/>
       </w:pPr>
       <w:r>
-        <w:t>Building UCSCU Connect, a SACCO apex platform and internal workplace hub, to move apex operations off spreadsheets and paper.</w:t>
+        <w:t>I help with everyday ICT work at the office.</w:t>
       </w:r>
     </w:p>
     <w:p>
@@ -414,7 +378,7 @@
         <w:spacing w:after="40"/>
       </w:pPr>
       <w:r>
-        <w:t>Worked on the SACCO registry with dues tracking, a Central Finance Facility (CFF) inter-lending workflow, and sector KPI dashboards.</w:t>
+        <w:t>I set up and take care of computers, printers and the internet.</w:t>
       </w:r>
     </w:p>
     <w:p>
@@ -423,7 +387,7 @@
         <w:spacing w:after="40"/>
       </w:pPr>
       <w:r>
-        <w:t>Helped add PEARLS quarterly reporting (WOCCU ratios) with CSV exports for regulators such as UMRA and the Bank of Uganda.</w:t>
+        <w:t>I help staff when they have computer problems (troubleshooting).</w:t>
       </w:r>
     </w:p>
     <w:p>
@@ -432,7 +396,7 @@
         <w:spacing w:after="40"/>
       </w:pPr>
       <w:r>
-        <w:t>Contributed to the training catalogue, events and certification, insurance (CIC Africa) claims, stationery shop, announcements, and governance tools (meetings, e-voting), plus a full admin audit log.</w:t>
+        <w:t>I run errands to town and help with other office duties when needed.</w:t>
       </w:r>
     </w:p>
     <w:p>
@@ -441,16 +405,7 @@
         <w:spacing w:after="40"/>
       </w:pPr>
       <w:r>
-        <w:t>Helped build workplace tools: office attendance on the local network, a visitors register, a staff discussion hub, a whistleblowing channel, document space and a shared calendar.</w:t>
-      </w:r>
-    </w:p>
-    <w:p>
-      <w:pPr>
-        <w:pStyle w:val="ListBullet"/>
-        <w:spacing w:after="40"/>
-      </w:pPr>
-      <w:r>
-        <w:t>Set up role-based access so admin, staff, board, SACCO and regulator users each see only what they should.</w:t>
+        <w:t>I am learning how SACCOs work from the inside.</w:t>
       </w:r>
     </w:p>
     <w:p>
@@ -474,7 +429,7 @@
         <w:rPr>
           <w:i/>
           <w:color w:val="555555"/>
-          <w:sz w:val="19"/>
+          <w:sz w:val="18"/>
         </w:rPr>
         <w:t>Kampala, Uganda  |  2025 - Present</w:t>
       </w:r>
@@ -485,7 +440,7 @@
         <w:spacing w:after="40"/>
       </w:pPr>
       <w:r>
-        <w:t>Founded and run Jordan Design Hub, delivering web and mobile apps, an online academy, ICT consultancy and media services to schools, SACCOs, clinics, SMEs and churches in Uganda.</w:t>
+        <w:t>I started Jordan Design Hub, where I build websites, simple apps and design work for schools, churches, small businesses and SACCOs.</w:t>
       </w:r>
     </w:p>
     <w:p>
@@ -494,7 +449,7 @@
         <w:spacing w:after="40"/>
       </w:pPr>
       <w:r>
-        <w:t>Took more than a dozen products from idea to a working, deployed state - web platforms, mobile apps, desktop software and AI tools (full list under Key Projects).</w:t>
+        <w:t>I listen to what the client needs, plan the work, build it (using AI tools such as OpenHands), test it and explain it back to them.</w:t>
       </w:r>
     </w:p>
     <w:p>
@@ -503,7 +458,7 @@
         <w:spacing w:after="40"/>
       </w:pPr>
       <w:r>
-        <w:t>Handle the whole journey: listening to the client, deciding what to build, building it with AI-assisted development (OpenHands), testing, deploying, and explaining it back to the client.</w:t>
+        <w:t>I have built several working systems. Some are now used by churches and schools.</w:t>
       </w:r>
     </w:p>
     <w:p>
@@ -512,7 +467,7 @@
         <w:spacing w:after="40"/>
       </w:pPr>
       <w:r>
-        <w:t>Set up automated processes that generate whitepaper PDFs, 48 lesson-outline PDFs, 90 marketing posters and a promo video.</w:t>
+        <w:t>I also design posters, logos and videos for clients.</w:t>
       </w:r>
     </w:p>
     <w:p>
@@ -521,7 +476,7 @@
         <w:spacing w:after="40"/>
       </w:pPr>
       <w:r>
-        <w:t>Design the brand, marketing materials and content that promote the products, and manage the budgets behind each project.</w:t>
+        <w:t>I handle the money and planning for each project myself.</w:t>
       </w:r>
     </w:p>
     <w:p>
@@ -534,7 +489,7 @@
           <w:color w:val="0B3D91"/>
           <w:sz w:val="21"/>
         </w:rPr>
-        <w:t>Team Lead - Media &amp; Technical Operations - Freelance / Ministry &amp; Events</w:t>
+        <w:t>Team Lead - Media &amp; Technical Operations - Freelance / Church &amp; Events</w:t>
       </w:r>
     </w:p>
     <w:p>
@@ -545,7 +500,7 @@
         <w:rPr>
           <w:i/>
           <w:color w:val="555555"/>
-          <w:sz w:val="19"/>
+          <w:sz w:val="18"/>
         </w:rPr>
         <w:t>2024 - Present</w:t>
       </w:r>
@@ -556,7 +511,7 @@
         <w:spacing w:after="40"/>
       </w:pPr>
       <w:r>
-        <w:t>Oversaw translation services, sound systems and media production for services and events.</w:t>
+        <w:t>I lead a small team that runs sound, media and translation for services and events.</w:t>
       </w:r>
     </w:p>
     <w:p>
@@ -565,7 +520,7 @@
         <w:spacing w:after="40"/>
       </w:pPr>
       <w:r>
-        <w:t>Managed technical setups for communication and public engagement, including livestreaming.</w:t>
+        <w:t>I set up and run the equipment and help with livestreaming.</w:t>
       </w:r>
     </w:p>
     <w:p>
@@ -589,7 +544,7 @@
         <w:rPr>
           <w:i/>
           <w:color w:val="555555"/>
-          <w:sz w:val="19"/>
+          <w:sz w:val="18"/>
         </w:rPr>
         <w:t>2025</w:t>
       </w:r>
@@ -600,7 +555,7 @@
         <w:spacing w:after="40"/>
       </w:pPr>
       <w:r>
-        <w:t>Marketed Airtel internet and WiFi packages, growing customer uptake through direct engagement and follow-up.</w:t>
+        <w:t>I sold Airtel internet and WiFi packages and followed up with customers.</w:t>
       </w:r>
     </w:p>
     <w:p>
@@ -624,7 +579,7 @@
         <w:rPr>
           <w:i/>
           <w:color w:val="555555"/>
-          <w:sz w:val="19"/>
+          <w:sz w:val="18"/>
         </w:rPr>
         <w:t>2025</w:t>
       </w:r>
@@ -635,7 +590,7 @@
         <w:spacing w:after="40"/>
       </w:pPr>
       <w:r>
-        <w:t>Coached students through their coding projects at the Code Camp, building their confidence and problem-solving skills.</w:t>
+        <w:t>I helped students with their coding projects and built their confidence.</w:t>
       </w:r>
     </w:p>
     <w:p>
@@ -659,7 +614,7 @@
         <w:rPr>
           <w:i/>
           <w:color w:val="555555"/>
-          <w:sz w:val="19"/>
+          <w:sz w:val="18"/>
         </w:rPr>
         <w:t>2025</w:t>
       </w:r>
@@ -670,7 +625,7 @@
         <w:spacing w:after="40"/>
       </w:pPr>
       <w:r>
-        <w:t>Delivered comprehensive STEM education, improving student performance through practical, engaging lessons.</w:t>
+        <w:t>I taught Physics and Mathematics and helped students improve their performance.</w:t>
       </w:r>
     </w:p>
     <w:p>
@@ -694,7 +649,7 @@
         <w:rPr>
           <w:i/>
           <w:color w:val="555555"/>
-          <w:sz w:val="19"/>
+          <w:sz w:val="18"/>
         </w:rPr>
         <w:t>2025</w:t>
       </w:r>
@@ -705,7 +660,7 @@
         <w:spacing w:after="40"/>
       </w:pPr>
       <w:r>
-        <w:t>Assessed clients' finances and gave structured financial guidance, supporting sound lending decisions.</w:t>
+        <w:t>I checked clients' finances and gave them simple financial advice.</w:t>
       </w:r>
     </w:p>
     <w:p>
@@ -729,7 +684,7 @@
         <w:rPr>
           <w:i/>
           <w:color w:val="555555"/>
-          <w:sz w:val="19"/>
+          <w:sz w:val="18"/>
         </w:rPr>
         <w:t>2024 - 2025</w:t>
       </w:r>
@@ -740,7 +695,7 @@
         <w:spacing w:after="40"/>
       </w:pPr>
       <w:r>
-        <w:t>Designed and delivered effective digital learning strategies, helping students build practical computer skills.</w:t>
+        <w:t>I taught computer skills and helped students learn practical ICT.</w:t>
       </w:r>
     </w:p>
     <w:p>
@@ -764,7 +719,7 @@
         <w:rPr>
           <w:i/>
           <w:color w:val="555555"/>
-          <w:sz w:val="19"/>
+          <w:sz w:val="18"/>
         </w:rPr>
         <w:t>2023 - 2024</w:t>
       </w:r>
@@ -775,7 +730,7 @@
         <w:spacing w:after="40"/>
       </w:pPr>
       <w:r>
-        <w:t>Executed marketing strategies that improved student engagement and enrolment interest.</w:t>
+        <w:t>I did marketing that increased student interest and enrolment.</w:t>
       </w:r>
     </w:p>
     <w:p>
@@ -799,7 +754,7 @@
         <w:rPr>
           <w:i/>
           <w:color w:val="555555"/>
-          <w:sz w:val="19"/>
+          <w:sz w:val="18"/>
         </w:rPr>
         <w:t>2022 - 2023</w:t>
       </w:r>
@@ -810,7 +765,7 @@
         <w:spacing w:after="40"/>
       </w:pPr>
       <w:r>
-        <w:t>Developed promotional materials and designs that enhanced brand visibility.</w:t>
+        <w:t>I designed posters and other materials for clients.</w:t>
       </w:r>
     </w:p>
     <w:p>
@@ -834,7 +789,7 @@
         <w:rPr>
           <w:i/>
           <w:color w:val="555555"/>
-          <w:sz w:val="19"/>
+          <w:sz w:val="18"/>
         </w:rPr>
         <w:t>2019 - 2021</w:t>
       </w:r>
@@ -845,34 +800,34 @@
         <w:spacing w:after="40"/>
       </w:pPr>
       <w:r>
-        <w:t>Conducted awareness campaigns and product distribution, growing product reach.</w:t>
+        <w:t>I carried out awareness campaigns and distributed products.</w:t>
       </w:r>
     </w:p>
     <w:p>
       <w:pPr>
-        <w:spacing w:before="220" w:after="60"/>
-        <w:ind w:left="80"/>
-        <w:shd w:val="clear" w:color="auto" w:fill="E8EEF9"/>
+        <w:spacing w:before="200" w:after="80"/>
+        <w:ind w:left="0"/>
+        <w:shd w:val="clear" w:color="auto" w:fill="0B3D91"/>
       </w:pPr>
       <w:r>
         <w:rPr>
           <w:b/>
-          <w:color w:val="0B3D91"/>
-          <w:sz w:val="22"/>
+          <w:color w:val="FFFFFF"/>
+          <w:sz w:val="21"/>
         </w:rPr>
-        <w:t xml:space="preserve">  KEY PROJECTS</w:t>
+        <w:t xml:space="preserve">  PROJECTS &amp; PRACTICAL WORK</w:t>
       </w:r>
     </w:p>
     <w:p>
       <w:pPr>
-        <w:spacing w:before="100" w:after="20"/>
+        <w:spacing w:before="80" w:after="20"/>
       </w:pPr>
       <w:r>
         <w:rPr>
           <w:b/>
           <w:sz w:val="21"/>
         </w:rPr>
-        <w:t>ClinicSync - Clinic, Pharmacy &amp; Drug-Shop System (live, Android + Windows + Linux)</w:t>
+        <w:t>Attendance Hub - Church &amp; Event Attendance (in use)</w:t>
       </w:r>
     </w:p>
     <w:p>
@@ -881,7 +836,7 @@
         <w:spacing w:after="40"/>
       </w:pPr>
       <w:r>
-        <w:t>An offline-first hospital, clinic and drug-shop system for low-resource settings: all reads and writes hit the local database first and sync to the cloud when the network returns.</w:t>
+        <w:t>A system that records who attends church services and events, keeps member details and prints reports.</w:t>
       </w:r>
     </w:p>
     <w:p>
@@ -890,46 +845,19 @@
         <w:spacing w:after="40"/>
       </w:pPr>
       <w:r>
-        <w:t>Point-of-sale with fast drug search, selling by tablet / strip / box, printable 80 mm thermal receipts; daily expenses; and a one-click end-of-day balance sheet with MTN/Airtel mobile-money reconciliation.</w:t>
+        <w:t>It is running on a computer, and I also made an Android app version.</w:t>
       </w:r>
     </w:p>
     <w:p>
       <w:pPr>
-        <w:pStyle w:val="ListBullet"/>
-        <w:spacing w:after="40"/>
-      </w:pPr>
-      <w:r>
-        <w:t>Inventory with FEFO (first-expire-first-out) batch expiry and reorder levels; tiered SaaS plans (Basic / Premium / Pro).</w:t>
-      </w:r>
-    </w:p>
-    <w:p>
-      <w:pPr>
-        <w:pStyle w:val="ListBullet"/>
-        <w:spacing w:after="40"/>
-      </w:pPr>
-      <w:r>
-        <w:t>Shipped installers for Android (APK), Windows (EXE) and Linux (AppImage / .deb), with device-bound activation licensing.</w:t>
-      </w:r>
-    </w:p>
-    <w:p>
-      <w:pPr>
-        <w:pStyle w:val="ListBullet"/>
-        <w:spacing w:after="40"/>
-      </w:pPr>
-      <w:r>
-        <w:t>Built with React/Vite, Tailwind, Express, Prisma and PouchDB.</w:t>
-      </w:r>
-    </w:p>
-    <w:p>
-      <w:pPr>
-        <w:spacing w:before="100" w:after="20"/>
+        <w:spacing w:before="80" w:after="20"/>
       </w:pPr>
       <w:r>
         <w:rPr>
           <w:b/>
           <w:sz w:val="21"/>
         </w:rPr>
-        <w:t>JD Hub CBS - Co-operative Banking System for SACCOs (prototype)</w:t>
+        <w:t>School Management System (in use)</w:t>
       </w:r>
     </w:p>
     <w:p>
@@ -938,7 +866,7 @@
         <w:spacing w:after="40"/>
       </w:pPr>
       <w:r>
-        <w:t>A modern core-banking system for SACCOs and credit unions, re-branded from a UCSCU CBS client.</w:t>
+        <w:t>Helps a school manage students, teachers, fees, marks and reports. It works without internet.</w:t>
       </w:r>
     </w:p>
     <w:p>
@@ -947,28 +875,19 @@
         <w:spacing w:after="40"/>
       </w:pPr>
       <w:r>
-        <w:t>Multi-user demo hub that gives each user an isolated instance behind a reverse proxy (JupyterHub-style).</w:t>
+        <w:t>It is installed and used by a school.</w:t>
       </w:r>
     </w:p>
     <w:p>
       <w:pPr>
-        <w:pStyle w:val="ListBullet"/>
-        <w:spacing w:after="40"/>
-      </w:pPr>
-      <w:r>
-        <w:t>Built with React 18, TypeScript, MUI, Apollo GraphQL and a mock GraphQL backend.</w:t>
-      </w:r>
-    </w:p>
-    <w:p>
-      <w:pPr>
-        <w:spacing w:before="100" w:after="20"/>
+        <w:spacing w:before="80" w:after="20"/>
       </w:pPr>
       <w:r>
         <w:rPr>
           <w:b/>
           <w:sz w:val="21"/>
         </w:rPr>
-        <w:t>MyMarket.ug - Multi-Vendor Marketplace (live)</w:t>
+        <w:t>Savings Bank SACCO App (in use)</w:t>
       </w:r>
     </w:p>
     <w:p>
@@ -977,37 +896,19 @@
         <w:spacing w:after="40"/>
       </w:pPr>
       <w:r>
-        <w:t>An online marketplace where Ugandan vendors each get their own shop page; customers browse and buy without an account.</w:t>
+        <w:t>A simple savings and credit app for SACCO members, made with Flutter.</w:t>
       </w:r>
     </w:p>
     <w:p>
       <w:pPr>
-        <w:pStyle w:val="ListBullet"/>
-        <w:spacing w:after="40"/>
-      </w:pPr>
-      <w:r>
-        <w:t>Takes real mobile-money payments through Flutterwave (MTN MoMo / Airtel); product photos are compressed for fast loading on 3G.</w:t>
-      </w:r>
-    </w:p>
-    <w:p>
-      <w:pPr>
-        <w:pStyle w:val="ListBullet"/>
-        <w:spacing w:after="40"/>
-      </w:pPr>
-      <w:r>
-        <w:t>Built with Python, Flask, SQLAlchemy, Tailwind CSS and Alpine.js.</w:t>
-      </w:r>
-    </w:p>
-    <w:p>
-      <w:pPr>
-        <w:spacing w:before="100" w:after="20"/>
+        <w:spacing w:before="80" w:after="20"/>
       </w:pPr>
       <w:r>
         <w:rPr>
           <w:b/>
           <w:sz w:val="21"/>
         </w:rPr>
-        <w:t>BizDocs - Invoicing for Small Businesses (live)</w:t>
+        <w:t>Church Media &amp; Sound (ongoing)</w:t>
       </w:r>
     </w:p>
     <w:p>
@@ -1016,37 +917,19 @@
         <w:spacing w:after="40"/>
       </w:pPr>
       <w:r>
-        <w:t>An offline-first Android app that creates invoices, receipts, quotations and letters, with finger-signature locking and an audit trail.</w:t>
+        <w:t>I run sound, media and livestreaming for church services and events, and train others to do it.</w:t>
       </w:r>
     </w:p>
     <w:p>
       <w:pPr>
-        <w:pStyle w:val="ListBullet"/>
-        <w:spacing w:after="40"/>
-      </w:pPr>
-      <w:r>
-        <w:t>Handles URA TIN details, UGX amounts and MTN/Airtel mobile-money payment tracking; exports to A4 or thermal PDF.</w:t>
-      </w:r>
-    </w:p>
-    <w:p>
-      <w:pPr>
-        <w:pStyle w:val="ListBullet"/>
-        <w:spacing w:after="40"/>
-      </w:pPr>
-      <w:r>
-        <w:t>Built with Flutter (Dart).</w:t>
-      </w:r>
-    </w:p>
-    <w:p>
-      <w:pPr>
-        <w:spacing w:before="100" w:after="20"/>
+        <w:spacing w:before="80" w:after="20"/>
       </w:pPr>
       <w:r>
         <w:rPr>
           <w:b/>
           <w:sz w:val="21"/>
         </w:rPr>
-        <w:t>UCSCU Connect - SACCO Apex Platform (in progress)</w:t>
+        <w:t>ClinicSync - Clinic &amp; Pharmacy System (in development)</w:t>
       </w:r>
     </w:p>
     <w:p>
@@ -1055,7 +938,7 @@
         <w:spacing w:after="40"/>
       </w:pPr>
       <w:r>
-        <w:t>A platform to help UCSCU run apex operations and internal workplace processes digitally (see the UCSCU role above).</w:t>
+        <w:t>A system for clinics and drug shops: sales, stock with expiry dates, daily expenses and end-of-day cash.</w:t>
       </w:r>
     </w:p>
     <w:p>
@@ -1064,19 +947,19 @@
         <w:spacing w:after="40"/>
       </w:pPr>
       <w:r>
-        <w:t>Built with Python, Flask and SQLAlchemy.</w:t>
+        <w:t>It is still being built and tested, not yet in use.</w:t>
       </w:r>
     </w:p>
     <w:p>
       <w:pPr>
-        <w:spacing w:before="100" w:after="20"/>
+        <w:spacing w:before="80" w:after="20"/>
       </w:pPr>
       <w:r>
         <w:rPr>
           <w:b/>
           <w:sz w:val="21"/>
         </w:rPr>
-        <w:t>Offline-First School Management System (in use)</w:t>
+        <w:t>UCSCU Connect (in development)</w:t>
       </w:r>
     </w:p>
     <w:p>
@@ -1085,37 +968,19 @@
         <w:spacing w:after="40"/>
       </w:pPr>
       <w:r>
-        <w:t>Covers students, teachers, fees, marks and reports, works without internet, and uses 9 role-based access levels; licensed per school and tied to the computer (HWID).</w:t>
+        <w:t>A system being built to help UCSCU with its work. It is still in development and not yet in use.</w:t>
       </w:r>
     </w:p>
     <w:p>
       <w:pPr>
-        <w:pStyle w:val="ListBullet"/>
-        <w:spacing w:after="40"/>
-      </w:pPr>
-      <w:r>
-        <w:t>Includes a QR parent kiosk and a multi-tenant cloud hub for sync, licensing and backups.</w:t>
-      </w:r>
-    </w:p>
-    <w:p>
-      <w:pPr>
-        <w:pStyle w:val="ListBullet"/>
-        <w:spacing w:after="40"/>
-      </w:pPr>
-      <w:r>
-        <w:t>Built with Django as an installable desktop application.</w:t>
-      </w:r>
-    </w:p>
-    <w:p>
-      <w:pPr>
-        <w:spacing w:before="100" w:after="20"/>
+        <w:spacing w:before="80" w:after="20"/>
       </w:pPr>
       <w:r>
         <w:rPr>
           <w:b/>
           <w:sz w:val="21"/>
         </w:rPr>
-        <w:t>Attendance Hub - Church &amp; Event Check-in (web + native Android)</w:t>
+        <w:t>JD Hub CBS - SACCO Banking System (prototype)</w:t>
       </w:r>
     </w:p>
     <w:p>
@@ -1124,37 +989,19 @@
         <w:spacing w:after="40"/>
       </w:pPr>
       <w:r>
-        <w:t>A check-in system for churches and events with member registration, reports and Excel export; the native Android version needs no server or internet at all.</w:t>
+        <w:t>A banking-style system for SACCOs, built as a prototype to learn how core banking works.</w:t>
       </w:r>
     </w:p>
     <w:p>
       <w:pPr>
-        <w:pStyle w:val="ListBullet"/>
-        <w:spacing w:after="40"/>
-      </w:pPr>
-      <w:r>
-        <w:t>The Android app adds LAN device linking so several phones on the same Wi-Fi share attendance in real time, plus activation keys and PDF reports.</w:t>
-      </w:r>
-    </w:p>
-    <w:p>
-      <w:pPr>
-        <w:pStyle w:val="ListBullet"/>
-        <w:spacing w:after="40"/>
-      </w:pPr>
-      <w:r>
-        <w:t>Built with Django (web) and Kotlin + Room + NanoHTTPD (Android).</w:t>
-      </w:r>
-    </w:p>
-    <w:p>
-      <w:pPr>
-        <w:spacing w:before="100" w:after="20"/>
+        <w:spacing w:before="80" w:after="20"/>
       </w:pPr>
       <w:r>
         <w:rPr>
           <w:b/>
           <w:sz w:val="21"/>
         </w:rPr>
-        <w:t>Kids AI Studio - Generative-AI Kids' Video Maker (open source)</w:t>
+        <w:t>MyMarket.ug - Online Market (in development)</w:t>
       </w:r>
     </w:p>
     <w:p>
@@ -1163,37 +1010,19 @@
         <w:spacing w:after="40"/>
       </w:pPr>
       <w:r>
-        <w:t>Turns one sentence into a finished animated kids' story video or sing-along song, using open-source generative AI models on a free Kaggle GPU.</w:t>
+        <w:t>An online market where vendors can show their goods and customers can pay by mobile money. Still being finished.</w:t>
       </w:r>
     </w:p>
     <w:p>
       <w:pPr>
-        <w:pStyle w:val="ListBullet"/>
-        <w:spacing w:after="40"/>
-      </w:pPr>
-      <w:r>
-        <w:t>Generates scenes, music, narration and captions into a finished MP4, with an image-to-video mode for personal pictures.</w:t>
-      </w:r>
-    </w:p>
-    <w:p>
-      <w:pPr>
-        <w:pStyle w:val="ListBullet"/>
-        <w:spacing w:after="40"/>
-      </w:pPr>
-      <w:r>
-        <w:t>Built in Python with ffmpeg and text-to-video / image-to-video models.</w:t>
-      </w:r>
-    </w:p>
-    <w:p>
-      <w:pPr>
-        <w:spacing w:before="100" w:after="20"/>
+        <w:spacing w:before="80" w:after="20"/>
       </w:pPr>
       <w:r>
         <w:rPr>
           <w:b/>
           <w:sz w:val="21"/>
         </w:rPr>
-        <w:t>MT5 Algorithmic Trading Bot (open source)</w:t>
+        <w:t>BizDocs - Invoices for Small Businesses (in development)</w:t>
       </w:r>
     </w:p>
     <w:p>
@@ -1202,37 +1031,19 @@
         <w:spacing w:after="40"/>
       </w:pPr>
       <w:r>
-        <w:t>A discipline-first MetaTrader 5 bot with ML signal generation (RandomForest), a 0.01-lot cap, a $10 daily circuit breaker, an 80/20 profit vault and Discord remote control.</w:t>
+        <w:t>An app for making invoices, receipts and quotations for small businesses. Still being built.</w:t>
       </w:r>
     </w:p>
     <w:p>
       <w:pPr>
-        <w:pStyle w:val="ListBullet"/>
-        <w:spacing w:after="40"/>
-      </w:pPr>
-      <w:r>
-        <w:t>Includes a vectorized backtester with walk-forward out-of-sample validation and per-strategy kill switches.</w:t>
-      </w:r>
-    </w:p>
-    <w:p>
-      <w:pPr>
-        <w:pStyle w:val="ListBullet"/>
-        <w:spacing w:after="40"/>
-      </w:pPr>
-      <w:r>
-        <w:t>Built in Python (scikit-learn, MT5 API).</w:t>
-      </w:r>
-    </w:p>
-    <w:p>
-      <w:pPr>
-        <w:spacing w:before="100" w:after="20"/>
+        <w:spacing w:before="80" w:after="20"/>
       </w:pPr>
       <w:r>
         <w:rPr>
           <w:b/>
           <w:sz w:val="21"/>
         </w:rPr>
-        <w:t>Savings Bank SACCO App (recovered &amp; improved)</w:t>
+        <w:t>Kids AI Studio (prototype)</w:t>
       </w:r>
     </w:p>
     <w:p>
@@ -1241,28 +1052,19 @@
         <w:spacing w:after="40"/>
       </w:pPr>
       <w:r>
-        <w:t>A Flutter savings-and-credit app for SACCO members, recovered and improved from an earlier build.</w:t>
+        <w:t>A fun project that turns one sentence into a short children's video or song using AI.</w:t>
       </w:r>
     </w:p>
     <w:p>
       <w:pPr>
-        <w:pStyle w:val="ListBullet"/>
-        <w:spacing w:after="40"/>
-      </w:pPr>
-      <w:r>
-        <w:t>Built with Flutter (Dart).</w:t>
-      </w:r>
-    </w:p>
-    <w:p>
-      <w:pPr>
-        <w:spacing w:before="100" w:after="20"/>
+        <w:spacing w:before="80" w:after="20"/>
       </w:pPr>
       <w:r>
         <w:rPr>
           <w:b/>
           <w:sz w:val="21"/>
         </w:rPr>
-        <w:t>JD Hub - Company Website &amp; Platform (live)</w:t>
+        <w:t>MT5 Trading Bot (prototype)</w:t>
       </w:r>
     </w:p>
     <w:p>
@@ -1271,37 +1073,19 @@
         <w:spacing w:after="40"/>
       </w:pPr>
       <w:r>
-        <w:t>The public site for Jordan Design Hub: systems showcase, academy catalogue, services, design gallery and WhatsApp lead capture.</w:t>
+        <w:t>A practice bot I built to learn about trading, money and risk.</w:t>
       </w:r>
     </w:p>
     <w:p>
       <w:pPr>
-        <w:pStyle w:val="ListBullet"/>
-        <w:spacing w:after="40"/>
-      </w:pPr>
-      <w:r>
-        <w:t>Includes a simple shop with mobile-money payment and a secure 48-hour download link after approval.</w:t>
-      </w:r>
-    </w:p>
-    <w:p>
-      <w:pPr>
-        <w:pStyle w:val="ListBullet"/>
-        <w:spacing w:after="40"/>
-      </w:pPr>
-      <w:r>
-        <w:t>Built with Django 5 and Bootstrap 5; deployed on Render.</w:t>
-      </w:r>
-    </w:p>
-    <w:p>
-      <w:pPr>
-        <w:spacing w:before="100" w:after="20"/>
+        <w:spacing w:before="80" w:after="20"/>
       </w:pPr>
       <w:r>
         <w:rPr>
           <w:b/>
           <w:sz w:val="21"/>
         </w:rPr>
-        <w:t>KJ - Chat App (prototype)</w:t>
+        <w:t>KJ Chat App (prototype)</w:t>
       </w:r>
     </w:p>
     <w:p>
@@ -1310,29 +1094,41 @@
         <w:spacing w:after="40"/>
       </w:pPr>
       <w:r>
-        <w:t>A messaging app with online status, big file sharing, voice and video calls, customisable themes, a private 'vault mode' and a social feed.</w:t>
+        <w:t>A chat app I built to learn how messaging apps work.</w:t>
       </w:r>
     </w:p>
     <w:p>
       <w:pPr>
-        <w:pStyle w:val="ListBullet"/>
-        <w:spacing w:after="40"/>
+        <w:spacing w:before="80" w:after="20"/>
       </w:pPr>
       <w:r>
-        <w:t>Built with Node.js, Express and Socket.IO, with an Android build packaged for testing.</w:t>
+        <w:rPr>
+          <w:b/>
+          <w:sz w:val="21"/>
+        </w:rPr>
+        <w:t>JD Hub Website (in development)</w:t>
       </w:r>
     </w:p>
     <w:p>
       <w:pPr>
-        <w:spacing w:before="220" w:after="60"/>
-        <w:ind w:left="80"/>
-        <w:shd w:val="clear" w:color="auto" w:fill="E8EEF9"/>
+        <w:pStyle w:val="ListBullet"/>
+        <w:spacing w:after="40"/>
+      </w:pPr>
+      <w:r>
+        <w:t>The website for my business, Jordan Design Hub.</w:t>
+      </w:r>
+    </w:p>
+    <w:p>
+      <w:pPr>
+        <w:spacing w:before="200" w:after="80"/>
+        <w:ind w:left="0"/>
+        <w:shd w:val="clear" w:color="auto" w:fill="0B3D91"/>
       </w:pPr>
       <w:r>
         <w:rPr>
           <w:b/>
-          <w:color w:val="0B3D91"/>
-          <w:sz w:val="22"/>
+          <w:color w:val="FFFFFF"/>
+          <w:sz w:val="21"/>
         </w:rPr>
         <w:t xml:space="preserve">  LEADERSHIP &amp; VOLUNTEER ROLES</w:t>
       </w:r>
@@ -1349,7 +1145,7 @@
         <w:t xml:space="preserve">Founder &amp; Chairperson - Apex Christian Union (2023 - 2025): </w:t>
       </w:r>
       <w:r>
-        <w:t>Established the Christian Union, fostering spiritual growth, collaboration and mentorship; organised large-scale outreaches and events.</w:t>
+        <w:t>I started the Christian Union at my university and led it, organising outreaches and events.</w:t>
       </w:r>
     </w:p>
     <w:p>
@@ -1364,7 +1160,7 @@
         <w:t xml:space="preserve">GRC - IT Faculty, Apex International University (2023 - 2024): </w:t>
       </w:r>
       <w:r>
-        <w:t>Represented student interests and facilitated IT faculty initiatives; advocated for student needs and strengthened academic collaboration.</w:t>
+        <w:t>I represented students and helped with faculty activities.</w:t>
       </w:r>
     </w:p>
     <w:p>
@@ -1379,20 +1175,20 @@
         <w:t xml:space="preserve">Team Lead - Media &amp; Technical Operations (2024 - Present): </w:t>
       </w:r>
       <w:r>
-        <w:t>Led translation services, sound systems and media production; managed technical setups for communication and public engagement.</w:t>
+        <w:t>I lead the media and sound team at church.</w:t>
       </w:r>
     </w:p>
     <w:p>
       <w:pPr>
-        <w:spacing w:before="220" w:after="60"/>
-        <w:ind w:left="80"/>
-        <w:shd w:val="clear" w:color="auto" w:fill="E8EEF9"/>
+        <w:spacing w:before="200" w:after="80"/>
+        <w:ind w:left="0"/>
+        <w:shd w:val="clear" w:color="auto" w:fill="0B3D91"/>
       </w:pPr>
       <w:r>
         <w:rPr>
           <w:b/>
-          <w:color w:val="0B3D91"/>
-          <w:sz w:val="22"/>
+          <w:color w:val="FFFFFF"/>
+          <w:sz w:val="21"/>
         </w:rPr>
         <w:t xml:space="preserve">  EDUCATION &amp; TRAINING</w:t>
       </w:r>
@@ -1409,7 +1205,7 @@
         <w:t xml:space="preserve">Bachelor of Science in Information Technology - </w:t>
       </w:r>
       <w:r>
-        <w:t>Apex International University  |  Graduated 2026 (graduation for 2024-2026 completers held together)</w:t>
+        <w:t>Apex International University  |  Graduated 2026</w:t>
       </w:r>
     </w:p>
     <w:p>
@@ -1474,17 +1270,17 @@
     </w:p>
     <w:p>
       <w:pPr>
-        <w:spacing w:before="220" w:after="60"/>
-        <w:ind w:left="80"/>
-        <w:shd w:val="clear" w:color="auto" w:fill="E8EEF9"/>
+        <w:spacing w:before="200" w:after="80"/>
+        <w:ind w:left="0"/>
+        <w:shd w:val="clear" w:color="auto" w:fill="0B3D91"/>
       </w:pPr>
       <w:r>
         <w:rPr>
           <w:b/>
-          <w:color w:val="0B3D91"/>
-          <w:sz w:val="22"/>
+          <w:color w:val="FFFFFF"/>
+          <w:sz w:val="21"/>
         </w:rPr>
-        <w:t xml:space="preserve">  SELF-TAUGHT SKILLS</w:t>
+        <w:t xml:space="preserve">  WHAT I HAVE LEARNED ON MY OWN</w:t>
       </w:r>
     </w:p>
     <w:p>
@@ -1493,7 +1289,7 @@
         <w:spacing w:after="40"/>
       </w:pPr>
       <w:r>
-        <w:t>Graphic design (Canva) - designing posters, branding and promotional materials</w:t>
+        <w:t>Graphic design with Canva - posters, logos and branding</w:t>
       </w:r>
     </w:p>
     <w:p>
@@ -1502,7 +1298,7 @@
         <w:spacing w:after="40"/>
       </w:pPr>
       <w:r>
-        <w:t>Content creation and video editing (InShot and other tools)</w:t>
+        <w:t>Video editing and content creation</w:t>
       </w:r>
     </w:p>
     <w:p>
@@ -1511,7 +1307,7 @@
         <w:spacing w:after="40"/>
       </w:pPr>
       <w:r>
-        <w:t>Church media and sound systems, plus livestreaming setups</w:t>
+        <w:t>Church media, sound systems and livestreaming</w:t>
       </w:r>
     </w:p>
     <w:p>
@@ -1520,7 +1316,7 @@
         <w:spacing w:after="40"/>
       </w:pPr>
       <w:r>
-        <w:t>AI agents - how they are built and used (currently learning in depth)</w:t>
+        <w:t>AI tools (OpenHands) and how to build and use AI agents</w:t>
       </w:r>
     </w:p>
     <w:p>
@@ -1529,7 +1325,7 @@
         <w:spacing w:after="40"/>
       </w:pPr>
       <w:r>
-        <w:t>Generative AI for media - text-to-video and image-to-video</w:t>
+        <w:t>Building websites and simple apps by working on real projects</w:t>
       </w:r>
     </w:p>
     <w:p>
@@ -1538,29 +1334,20 @@
         <w:spacing w:after="40"/>
       </w:pPr>
       <w:r>
-        <w:t>Web, mobile and desktop development, learned largely by building real projects</w:t>
+        <w:t>Teaching and helping other people learn computer skills</w:t>
       </w:r>
     </w:p>
     <w:p>
       <w:pPr>
-        <w:pStyle w:val="ListBullet"/>
-        <w:spacing w:after="40"/>
-      </w:pPr>
-      <w:r>
-        <w:t>ICT training and teaching - passing skills on to students and colleagues</w:t>
-      </w:r>
-    </w:p>
-    <w:p>
-      <w:pPr>
-        <w:spacing w:before="220" w:after="60"/>
-        <w:ind w:left="80"/>
-        <w:shd w:val="clear" w:color="auto" w:fill="E8EEF9"/>
+        <w:spacing w:before="200" w:after="80"/>
+        <w:ind w:left="0"/>
+        <w:shd w:val="clear" w:color="auto" w:fill="0B3D91"/>
       </w:pPr>
       <w:r>
         <w:rPr>
           <w:b/>
-          <w:color w:val="0B3D91"/>
-          <w:sz w:val="22"/>
+          <w:color w:val="FFFFFF"/>
+          <w:sz w:val="21"/>
         </w:rPr>
         <w:t xml:space="preserve">  LANGUAGES</w:t>
       </w:r>
@@ -1594,15 +1381,15 @@
     </w:p>
     <w:p>
       <w:pPr>
-        <w:spacing w:before="220" w:after="60"/>
-        <w:ind w:left="80"/>
-        <w:shd w:val="clear" w:color="auto" w:fill="E8EEF9"/>
+        <w:spacing w:before="200" w:after="80"/>
+        <w:ind w:left="0"/>
+        <w:shd w:val="clear" w:color="auto" w:fill="0B3D91"/>
       </w:pPr>
       <w:r>
         <w:rPr>
           <w:b/>
-          <w:color w:val="0B3D91"/>
-          <w:sz w:val="22"/>
+          <w:color w:val="FFFFFF"/>
+          <w:sz w:val="21"/>
         </w:rPr>
         <w:t xml:space="preserve">  REFERENCES</w:t>
       </w:r>
@@ -1636,7 +1423,7 @@
     </w:p>
     <w:sectPr>
       <w:pgSz w:w="12240" w:h="15840"/>
-      <w:pgMar w:top="720" w:right="864" w:bottom="720" w:left="864" w:header="720" w:footer="720" w:gutter="0"/>
+      <w:pgMar w:top="648" w:right="792" w:bottom="648" w:left="792" w:header="720" w:footer="720" w:gutter="0"/>
       <w:cols w:space="720"/>
       <w:docGrid w:linePitch="360"/>
     </w:sectPr>

</xml_diff>

<commit_message>
Match original CV tone; remove job-wanted section; muted slate-blue palette; tighten to 2 pages
</commit_message>
<xml_diff>
--- a/CV_Mubogi_Jordan.docx
+++ b/CV_Mubogi_Jordan.docx
@@ -15,8 +15,7 @@
       <w:tr>
         <w:tc>
           <w:tcPr>
-            <w:tcW w:type="dxa" w:w="5328"/>
-            <w:shd w:val="clear" w:color="auto" w:fill="0B3D91"/>
+            <w:tcW w:type="dxa" w:w="5256"/>
           </w:tcPr>
           <w:p>
             <w:pPr>
@@ -61,32 +60,19 @@
         </w:tc>
         <w:tc>
           <w:tcPr>
-            <w:tcW w:type="dxa" w:w="5328"/>
-            <w:shd w:val="clear" w:color="auto" w:fill="0B3D91"/>
+            <w:tcW w:type="dxa" w:w="5256"/>
           </w:tcPr>
-          <w:p>
-            <w:pPr>
-              <w:spacing w:after="0"/>
-            </w:pPr>
-            <w:r>
-              <w:rPr>
-                <w:b/>
-                <w:color w:val="FFFFFF"/>
-                <w:sz w:val="38"/>
-              </w:rPr>
-              <w:t>MUBOGI GASTAVAS JORDAN</w:t>
-            </w:r>
-          </w:p>
           <w:p>
             <w:pPr>
               <w:spacing w:after="40"/>
             </w:pPr>
             <w:r>
               <w:rPr>
-                <w:color w:val="CFE0FF"/>
-                <w:sz w:val="19"/>
+                <w:b/>
+                <w:color w:val="1F3A5F"/>
+                <w:sz w:val="40"/>
               </w:rPr>
-              <w:t>ICT &amp; Computer Skills  ·  Teaching  ·  Sales &amp; Customer Care  ·  Media &amp; Design</w:t>
+              <w:t>MUBOGI GASTAVAS JORDAN</w:t>
             </w:r>
           </w:p>
           <w:p>
@@ -95,10 +81,10 @@
             </w:pPr>
             <w:r>
               <w:rPr>
-                <w:color w:val="FFFFFF"/>
-                <w:sz w:val="17"/>
+                <w:color w:val="5A5A5A"/>
+                <w:sz w:val="18"/>
               </w:rPr>
-              <w:t>Kampala, Uganda | +256 754 687 597 | +256 768 593 543 | mubogigastavasjordan@gmail.com | github.com/Mubogi</w:t>
+              <w:t>Kampala, Uganda · +256 754 687 597 · +256 768 593 543 · mubogigastavasjordan@gmail.com</w:t>
             </w:r>
           </w:p>
         </w:tc>
@@ -106,9 +92,16 @@
     </w:tbl>
     <w:p>
       <w:pPr>
+        <w:spacing w:before="40" w:after="120"/>
+        <w:pBdr>
+          <w:bottom w:val="single" w:sz="12" w:space="1" w:color="1F3A5F"/>
+        </w:pBdr>
+      </w:pPr>
+    </w:p>
+    <w:p>
+      <w:pPr>
         <w:spacing w:before="200" w:after="80"/>
-        <w:ind w:left="0"/>
-        <w:shd w:val="clear" w:color="auto" w:fill="0B3D91"/>
+        <w:shd w:val="clear" w:color="auto" w:fill="1F3A5F"/>
       </w:pPr>
       <w:r>
         <w:rPr>
@@ -116,7 +109,7 @@
           <w:color w:val="FFFFFF"/>
           <w:sz w:val="21"/>
         </w:rPr>
-        <w:t xml:space="preserve">  ABOUT ME</w:t>
+        <w:t xml:space="preserve">  PROFESSIONAL SUMMARY</w:t>
       </w:r>
     </w:p>
     <w:p>
@@ -124,209 +117,13 @@
         <w:spacing w:after="80"/>
       </w:pPr>
       <w:r>
-        <w:t>I am an ICT professional from Kampala with a degree in Information Technology. I have worked in teaching, sales, customer care, finance and media, and I also build websites and simple apps. I learn new things quickly, I am honest and hardworking, and I work well with people and under pressure. I am ready to do any job I am given and to give it my best.</w:t>
+        <w:t>Results-driven professional with expertise in leadership, education, technical solutions, and strategic communication. Experienced in team coordination, event planning, financial management, and digital branding. Proven ability to lead initiatives, manage projects, and optimize operations across different sectors.</w:t>
       </w:r>
     </w:p>
     <w:p>
       <w:pPr>
         <w:spacing w:before="200" w:after="80"/>
-        <w:ind w:left="0"/>
-        <w:shd w:val="clear" w:color="auto" w:fill="0B3D91"/>
-      </w:pPr>
-      <w:r>
-        <w:rPr>
-          <w:b/>
-          <w:color w:val="FFFFFF"/>
-          <w:sz w:val="21"/>
-        </w:rPr>
-        <w:t xml:space="preserve">  QUICK FACTS</w:t>
-      </w:r>
-    </w:p>
-    <w:p>
-      <w:pPr>
-        <w:pStyle w:val="ListBullet"/>
-        <w:spacing w:after="40"/>
-      </w:pPr>
-      <w:r>
-        <w:rPr>
-          <w:b/>
-        </w:rPr>
-        <w:t xml:space="preserve">What I am looking for: </w:t>
-      </w:r>
-      <w:r>
-        <w:t>Any job I can do well - ICT, teaching, sales, customer care, media or office work</w:t>
-      </w:r>
-    </w:p>
-    <w:p>
-      <w:pPr>
-        <w:pStyle w:val="ListBullet"/>
-        <w:spacing w:after="40"/>
-      </w:pPr>
-      <w:r>
-        <w:rPr>
-          <w:b/>
-        </w:rPr>
-        <w:t xml:space="preserve">Availability: </w:t>
-      </w:r>
-      <w:r>
-        <w:t>Full-time or part-time; ready to start anytime; can work under pressure</w:t>
-      </w:r>
-    </w:p>
-    <w:p>
-      <w:pPr>
-        <w:pStyle w:val="ListBullet"/>
-        <w:spacing w:after="40"/>
-      </w:pPr>
-      <w:r>
-        <w:rPr>
-          <w:b/>
-        </w:rPr>
-        <w:t xml:space="preserve">Location: </w:t>
-      </w:r>
-      <w:r>
-        <w:t>Kampala, Uganda (ready to travel)</w:t>
-      </w:r>
-    </w:p>
-    <w:p>
-      <w:pPr>
-        <w:pStyle w:val="ListBullet"/>
-        <w:spacing w:after="40"/>
-      </w:pPr>
-      <w:r>
-        <w:rPr>
-          <w:b/>
-        </w:rPr>
-        <w:t xml:space="preserve">Currently: </w:t>
-      </w:r>
-      <w:r>
-        <w:t>Volunteering at UCSCU; studying a Certificate in Theology</w:t>
-      </w:r>
-    </w:p>
-    <w:p>
-      <w:pPr>
-        <w:pStyle w:val="ListBullet"/>
-        <w:spacing w:after="40"/>
-      </w:pPr>
-      <w:r>
-        <w:rPr>
-          <w:b/>
-        </w:rPr>
-        <w:t xml:space="preserve">Goal: </w:t>
-      </w:r>
-      <w:r>
-        <w:t>To keep learning and grow into a bigger role</w:t>
-      </w:r>
-    </w:p>
-    <w:p>
-      <w:pPr>
-        <w:spacing w:before="200" w:after="80"/>
-        <w:ind w:left="0"/>
-        <w:shd w:val="clear" w:color="auto" w:fill="0B3D91"/>
-      </w:pPr>
-      <w:r>
-        <w:rPr>
-          <w:b/>
-          <w:color w:val="FFFFFF"/>
-          <w:sz w:val="21"/>
-        </w:rPr>
-        <w:t xml:space="preserve">  SKILLS</w:t>
-      </w:r>
-    </w:p>
-    <w:p>
-      <w:pPr>
-        <w:pStyle w:val="ListBullet"/>
-        <w:spacing w:after="40"/>
-      </w:pPr>
-      <w:r>
-        <w:rPr>
-          <w:b/>
-        </w:rPr>
-        <w:t xml:space="preserve">ICT &amp; Computer Skills: </w:t>
-      </w:r>
-      <w:r>
-        <w:t>Using and setting up computers, Microsoft Office (Word, Excel, PowerPoint), internet and email, fixing simple computer problems, teaching computer skills to others</w:t>
-      </w:r>
-    </w:p>
-    <w:p>
-      <w:pPr>
-        <w:pStyle w:val="ListBullet"/>
-        <w:spacing w:after="40"/>
-      </w:pPr>
-      <w:r>
-        <w:rPr>
-          <w:b/>
-        </w:rPr>
-        <w:t xml:space="preserve">Websites &amp; Apps: </w:t>
-      </w:r>
-      <w:r>
-        <w:t>I can build websites and simple apps using Python, Django, Flask, JavaScript, HTML, CSS, Flutter and Node.js, with help from AI tools such as OpenHands. I understand how they work, and I test and set them up myself.</w:t>
-      </w:r>
-    </w:p>
-    <w:p>
-      <w:pPr>
-        <w:pStyle w:val="ListBullet"/>
-        <w:spacing w:after="40"/>
-      </w:pPr>
-      <w:r>
-        <w:rPr>
-          <w:b/>
-        </w:rPr>
-        <w:t xml:space="preserve">Design &amp; Media: </w:t>
-      </w:r>
-      <w:r>
-        <w:t>Graphic design (Canva), making posters and logos, editing videos, content creation, running sound and media for church services and events, livestreaming</w:t>
-      </w:r>
-    </w:p>
-    <w:p>
-      <w:pPr>
-        <w:pStyle w:val="ListBullet"/>
-        <w:spacing w:after="40"/>
-      </w:pPr>
-      <w:r>
-        <w:rPr>
-          <w:b/>
-        </w:rPr>
-        <w:t xml:space="preserve">Sales &amp; Customer Care: </w:t>
-      </w:r>
-      <w:r>
-        <w:t>Direct sales, marketing, talking to customers, following up with clients, building good relationships with people</w:t>
-      </w:r>
-    </w:p>
-    <w:p>
-      <w:pPr>
-        <w:pStyle w:val="ListBullet"/>
-        <w:spacing w:after="40"/>
-      </w:pPr>
-      <w:r>
-        <w:rPr>
-          <w:b/>
-        </w:rPr>
-        <w:t xml:space="preserve">Money &amp; Records: </w:t>
-      </w:r>
-      <w:r>
-        <w:t>Budgeting, keeping records, assessing loans, managing small funds, organising work</w:t>
-      </w:r>
-    </w:p>
-    <w:p>
-      <w:pPr>
-        <w:pStyle w:val="ListBullet"/>
-        <w:spacing w:after="40"/>
-      </w:pPr>
-      <w:r>
-        <w:rPr>
-          <w:b/>
-        </w:rPr>
-        <w:t xml:space="preserve">Leadership &amp; People: </w:t>
-      </w:r>
-      <w:r>
-        <w:t>Leading small teams, planning events, public speaking, teaching and mentoring others, working with different kinds of people</w:t>
-      </w:r>
-    </w:p>
-    <w:p>
-      <w:pPr>
-        <w:spacing w:before="200" w:after="80"/>
-        <w:ind w:left="0"/>
-        <w:shd w:val="clear" w:color="auto" w:fill="0B3D91"/>
+        <w:shd w:val="clear" w:color="auto" w:fill="1F3A5F"/>
       </w:pPr>
       <w:r>
         <w:rPr>
@@ -339,12 +136,12 @@
     </w:p>
     <w:p>
       <w:pPr>
-        <w:spacing w:before="120" w:after="0"/>
+        <w:spacing w:before="100" w:after="0"/>
       </w:pPr>
       <w:r>
         <w:rPr>
           <w:b/>
-          <w:color w:val="0B3D91"/>
+          <w:color w:val="1F3A5F"/>
           <w:sz w:val="21"/>
         </w:rPr>
         <w:t>ICT Volunteer - UCSCU - Uganda Cooperative Savings and Credit Union Limited</w:t>
@@ -352,15 +149,318 @@
     </w:p>
     <w:p>
       <w:pPr>
-        <w:spacing w:after="40"/>
+        <w:spacing w:after="20"/>
       </w:pPr>
       <w:r>
         <w:rPr>
           <w:i/>
-          <w:color w:val="555555"/>
+          <w:color w:val="5A5A5A"/>
           <w:sz w:val="18"/>
         </w:rPr>
-        <w:t>Kampala, Uganda  |  2026 - Present</w:t>
+        <w:t>2026 - Present</w:t>
+      </w:r>
+    </w:p>
+    <w:p>
+      <w:pPr>
+        <w:spacing w:after="40"/>
+        <w:ind w:left="120"/>
+      </w:pPr>
+      <w:r>
+        <w:t>Provide day-to-day ICT support, set up and maintain computers, printers and internet, help staff with computer problems, and assist with other office duties.</w:t>
+      </w:r>
+    </w:p>
+    <w:p>
+      <w:pPr>
+        <w:spacing w:before="100" w:after="0"/>
+      </w:pPr>
+      <w:r>
+        <w:rPr>
+          <w:b/>
+          <w:color w:val="1F3A5F"/>
+          <w:sz w:val="21"/>
+        </w:rPr>
+        <w:t>Direct Sales Executive - Airtel Uganda</w:t>
+      </w:r>
+    </w:p>
+    <w:p>
+      <w:pPr>
+        <w:spacing w:after="20"/>
+      </w:pPr>
+      <w:r>
+        <w:rPr>
+          <w:i/>
+          <w:color w:val="5A5A5A"/>
+          <w:sz w:val="18"/>
+        </w:rPr>
+        <w:t>2025</w:t>
+      </w:r>
+    </w:p>
+    <w:p>
+      <w:pPr>
+        <w:spacing w:after="40"/>
+        <w:ind w:left="120"/>
+      </w:pPr>
+      <w:r>
+        <w:t>Marketing airtel Internet or wifi.</w:t>
+      </w:r>
+    </w:p>
+    <w:p>
+      <w:pPr>
+        <w:spacing w:before="100" w:after="0"/>
+      </w:pPr>
+      <w:r>
+        <w:rPr>
+          <w:b/>
+          <w:color w:val="1F3A5F"/>
+          <w:sz w:val="21"/>
+        </w:rPr>
+        <w:t>Code Instructor (Intern) - Code Academy Uganda</w:t>
+      </w:r>
+    </w:p>
+    <w:p>
+      <w:pPr>
+        <w:spacing w:after="20"/>
+      </w:pPr>
+      <w:r>
+        <w:rPr>
+          <w:i/>
+          <w:color w:val="5A5A5A"/>
+          <w:sz w:val="18"/>
+        </w:rPr>
+        <w:t>2025</w:t>
+      </w:r>
+    </w:p>
+    <w:p>
+      <w:pPr>
+        <w:spacing w:after="40"/>
+        <w:ind w:left="120"/>
+      </w:pPr>
+      <w:r>
+        <w:t>Helped students in accomplishing their code projects in the Code Camp.</w:t>
+      </w:r>
+    </w:p>
+    <w:p>
+      <w:pPr>
+        <w:spacing w:before="100" w:after="0"/>
+      </w:pPr>
+      <w:r>
+        <w:rPr>
+          <w:b/>
+          <w:color w:val="1F3A5F"/>
+          <w:sz w:val="21"/>
+        </w:rPr>
+        <w:t>Physics &amp; Mathematics Teacher - Destiny College International</w:t>
+      </w:r>
+    </w:p>
+    <w:p>
+      <w:pPr>
+        <w:spacing w:after="20"/>
+      </w:pPr>
+      <w:r>
+        <w:rPr>
+          <w:i/>
+          <w:color w:val="5A5A5A"/>
+          <w:sz w:val="18"/>
+        </w:rPr>
+        <w:t>2025</w:t>
+      </w:r>
+    </w:p>
+    <w:p>
+      <w:pPr>
+        <w:spacing w:after="40"/>
+        <w:ind w:left="120"/>
+      </w:pPr>
+      <w:r>
+        <w:t>Delivered comprehensive STEM education, enhancing student performance.</w:t>
+      </w:r>
+    </w:p>
+    <w:p>
+      <w:pPr>
+        <w:spacing w:before="100" w:after="0"/>
+      </w:pPr>
+      <w:r>
+        <w:rPr>
+          <w:b/>
+          <w:color w:val="1F3A5F"/>
+          <w:sz w:val="21"/>
+        </w:rPr>
+        <w:t>Credit Officer - Credit Watch Services International</w:t>
+      </w:r>
+    </w:p>
+    <w:p>
+      <w:pPr>
+        <w:spacing w:after="20"/>
+      </w:pPr>
+      <w:r>
+        <w:rPr>
+          <w:i/>
+          <w:color w:val="5A5A5A"/>
+          <w:sz w:val="18"/>
+        </w:rPr>
+        <w:t>Previous Role, 2025</w:t>
+      </w:r>
+    </w:p>
+    <w:p>
+      <w:pPr>
+        <w:spacing w:after="40"/>
+        <w:ind w:left="120"/>
+      </w:pPr>
+      <w:r>
+        <w:t>Managed client financial assessments, providing structured financial guidance.</w:t>
+      </w:r>
+    </w:p>
+    <w:p>
+      <w:pPr>
+        <w:spacing w:before="100" w:after="0"/>
+      </w:pPr>
+      <w:r>
+        <w:rPr>
+          <w:b/>
+          <w:color w:val="1F3A5F"/>
+          <w:sz w:val="21"/>
+        </w:rPr>
+        <w:t>ICT Teacher - Semuto Senior Secondary School</w:t>
+      </w:r>
+    </w:p>
+    <w:p>
+      <w:pPr>
+        <w:spacing w:after="20"/>
+      </w:pPr>
+      <w:r>
+        <w:rPr>
+          <w:i/>
+          <w:color w:val="5A5A5A"/>
+          <w:sz w:val="18"/>
+        </w:rPr>
+        <w:t>Previous Role, 2024 - 2025</w:t>
+      </w:r>
+    </w:p>
+    <w:p>
+      <w:pPr>
+        <w:spacing w:after="40"/>
+        <w:ind w:left="120"/>
+      </w:pPr>
+      <w:r>
+        <w:t>Designed and implemented effective digital learning strategies.</w:t>
+      </w:r>
+    </w:p>
+    <w:p>
+      <w:pPr>
+        <w:spacing w:before="100" w:after="0"/>
+      </w:pPr>
+      <w:r>
+        <w:rPr>
+          <w:b/>
+          <w:color w:val="1F3A5F"/>
+          <w:sz w:val="21"/>
+        </w:rPr>
+        <w:t>Marketer - Apex International University</w:t>
+      </w:r>
+    </w:p>
+    <w:p>
+      <w:pPr>
+        <w:spacing w:after="20"/>
+      </w:pPr>
+      <w:r>
+        <w:rPr>
+          <w:i/>
+          <w:color w:val="5A5A5A"/>
+          <w:sz w:val="18"/>
+        </w:rPr>
+        <w:t>2023 - 2024</w:t>
+      </w:r>
+    </w:p>
+    <w:p>
+      <w:pPr>
+        <w:spacing w:after="40"/>
+        <w:ind w:left="120"/>
+      </w:pPr>
+      <w:r>
+        <w:t>Executed marketing strategies improving student engagement.</w:t>
+      </w:r>
+    </w:p>
+    <w:p>
+      <w:pPr>
+        <w:spacing w:before="100" w:after="0"/>
+      </w:pPr>
+      <w:r>
+        <w:rPr>
+          <w:b/>
+          <w:color w:val="1F3A5F"/>
+          <w:sz w:val="21"/>
+        </w:rPr>
+        <w:t>Graphics Designer - Magix Graphics</w:t>
+      </w:r>
+    </w:p>
+    <w:p>
+      <w:pPr>
+        <w:spacing w:after="20"/>
+      </w:pPr>
+      <w:r>
+        <w:rPr>
+          <w:i/>
+          <w:color w:val="5A5A5A"/>
+          <w:sz w:val="18"/>
+        </w:rPr>
+        <w:t>2022 - 2023</w:t>
+      </w:r>
+    </w:p>
+    <w:p>
+      <w:pPr>
+        <w:spacing w:after="40"/>
+        <w:ind w:left="120"/>
+      </w:pPr>
+      <w:r>
+        <w:t>Developed promotional materials to enhance brand visibility.</w:t>
+      </w:r>
+    </w:p>
+    <w:p>
+      <w:pPr>
+        <w:spacing w:before="100" w:after="0"/>
+      </w:pPr>
+      <w:r>
+        <w:rPr>
+          <w:b/>
+          <w:color w:val="1F3A5F"/>
+          <w:sz w:val="21"/>
+        </w:rPr>
+        <w:t>Sales Promoter - Jajopa International Limited</w:t>
+      </w:r>
+    </w:p>
+    <w:p>
+      <w:pPr>
+        <w:spacing w:after="20"/>
+      </w:pPr>
+      <w:r>
+        <w:rPr>
+          <w:i/>
+          <w:color w:val="5A5A5A"/>
+          <w:sz w:val="18"/>
+        </w:rPr>
+        <w:t>2019 - 2021</w:t>
+      </w:r>
+    </w:p>
+    <w:p>
+      <w:pPr>
+        <w:spacing w:after="40"/>
+        <w:ind w:left="120"/>
+      </w:pPr>
+      <w:r>
+        <w:t>Conducted awareness campaigns and product distribution.</w:t>
+      </w:r>
+    </w:p>
+    <w:p>
+      <w:pPr>
+        <w:spacing w:before="200" w:after="80"/>
+        <w:shd w:val="clear" w:color="auto" w:fill="1F3A5F"/>
+      </w:pPr>
+      <w:r>
+        <w:rPr>
+          <w:b/>
+          <w:color w:val="FFFFFF"/>
+          <w:sz w:val="21"/>
+        </w:rPr>
+        <w:t xml:space="preserve">  SKILLS &amp; PROFICIENCIES</w:t>
       </w:r>
     </w:p>
     <w:p>
@@ -369,7 +469,13 @@
         <w:spacing w:after="40"/>
       </w:pPr>
       <w:r>
-        <w:t>I help with everyday ICT work at the office.</w:t>
+        <w:rPr>
+          <w:b/>
+        </w:rPr>
+        <w:t xml:space="preserve">Leadership &amp; Project Management: </w:t>
+      </w:r>
+      <w:r>
+        <w:t>Initiative coordination, team mentorship, project planning.</w:t>
       </w:r>
     </w:p>
     <w:p>
@@ -378,7 +484,13 @@
         <w:spacing w:after="40"/>
       </w:pPr>
       <w:r>
-        <w:t>I set up and take care of computers, printers and the internet.</w:t>
+        <w:rPr>
+          <w:b/>
+        </w:rPr>
+        <w:t xml:space="preserve">Technical &amp; Digital Solutions: </w:t>
+      </w:r>
+      <w:r>
+        <w:t>Web design, graphics design, IT training, computer support and troubleshooting, Microsoft Office, building websites and simple apps with AI-assisted tools.</w:t>
       </w:r>
     </w:p>
     <w:p>
@@ -387,7 +499,13 @@
         <w:spacing w:after="40"/>
       </w:pPr>
       <w:r>
-        <w:t>I help staff when they have computer problems (troubleshooting).</w:t>
+        <w:rPr>
+          <w:b/>
+        </w:rPr>
+        <w:t xml:space="preserve">Finance &amp; Organizational Strategy: </w:t>
+      </w:r>
+      <w:r>
+        <w:t>Budgeting, credit assessment, workflow optimization, record keeping.</w:t>
       </w:r>
     </w:p>
     <w:p>
@@ -396,7 +514,13 @@
         <w:spacing w:after="40"/>
       </w:pPr>
       <w:r>
-        <w:t>I run errands to town and help with other office duties when needed.</w:t>
+        <w:rPr>
+          <w:b/>
+        </w:rPr>
+        <w:t xml:space="preserve">Communication &amp; Marketing: </w:t>
+      </w:r>
+      <w:r>
+        <w:t>Public speaking, digital branding, campaign strategies, customer care.</w:t>
       </w:r>
     </w:p>
     <w:p>
@@ -405,409 +529,19 @@
         <w:spacing w:after="40"/>
       </w:pPr>
       <w:r>
-        <w:t>I am learning how SACCOs work from the inside.</w:t>
-      </w:r>
-    </w:p>
-    <w:p>
-      <w:pPr>
-        <w:spacing w:before="120" w:after="0"/>
-      </w:pPr>
-      <w:r>
         <w:rPr>
           <w:b/>
-          <w:color w:val="0B3D91"/>
-          <w:sz w:val="21"/>
         </w:rPr>
-        <w:t>Founder &amp; Product Builder - Jordan Design Hub (JD Hub)</w:t>
+        <w:t xml:space="preserve">Media &amp; Creative: </w:t>
       </w:r>
-    </w:p>
-    <w:p>
-      <w:pPr>
-        <w:spacing w:after="40"/>
-      </w:pPr>
       <w:r>
-        <w:rPr>
-          <w:i/>
-          <w:color w:val="555555"/>
-          <w:sz w:val="18"/>
-        </w:rPr>
-        <w:t>Kampala, Uganda  |  2025 - Present</w:t>
-      </w:r>
-    </w:p>
-    <w:p>
-      <w:pPr>
-        <w:pStyle w:val="ListBullet"/>
-        <w:spacing w:after="40"/>
-      </w:pPr>
-      <w:r>
-        <w:t>I started Jordan Design Hub, where I build websites, simple apps and design work for schools, churches, small businesses and SACCOs.</w:t>
-      </w:r>
-    </w:p>
-    <w:p>
-      <w:pPr>
-        <w:pStyle w:val="ListBullet"/>
-        <w:spacing w:after="40"/>
-      </w:pPr>
-      <w:r>
-        <w:t>I listen to what the client needs, plan the work, build it (using AI tools such as OpenHands), test it and explain it back to them.</w:t>
-      </w:r>
-    </w:p>
-    <w:p>
-      <w:pPr>
-        <w:pStyle w:val="ListBullet"/>
-        <w:spacing w:after="40"/>
-      </w:pPr>
-      <w:r>
-        <w:t>I have built several working systems. Some are now used by churches and schools.</w:t>
-      </w:r>
-    </w:p>
-    <w:p>
-      <w:pPr>
-        <w:pStyle w:val="ListBullet"/>
-        <w:spacing w:after="40"/>
-      </w:pPr>
-      <w:r>
-        <w:t>I also design posters, logos and videos for clients.</w:t>
-      </w:r>
-    </w:p>
-    <w:p>
-      <w:pPr>
-        <w:pStyle w:val="ListBullet"/>
-        <w:spacing w:after="40"/>
-      </w:pPr>
-      <w:r>
-        <w:t>I handle the money and planning for each project myself.</w:t>
-      </w:r>
-    </w:p>
-    <w:p>
-      <w:pPr>
-        <w:spacing w:before="120" w:after="0"/>
-      </w:pPr>
-      <w:r>
-        <w:rPr>
-          <w:b/>
-          <w:color w:val="0B3D91"/>
-          <w:sz w:val="21"/>
-        </w:rPr>
-        <w:t>Team Lead - Media &amp; Technical Operations - Freelance / Church &amp; Events</w:t>
-      </w:r>
-    </w:p>
-    <w:p>
-      <w:pPr>
-        <w:spacing w:after="40"/>
-      </w:pPr>
-      <w:r>
-        <w:rPr>
-          <w:i/>
-          <w:color w:val="555555"/>
-          <w:sz w:val="18"/>
-        </w:rPr>
-        <w:t>2024 - Present</w:t>
-      </w:r>
-    </w:p>
-    <w:p>
-      <w:pPr>
-        <w:pStyle w:val="ListBullet"/>
-        <w:spacing w:after="40"/>
-      </w:pPr>
-      <w:r>
-        <w:t>I lead a small team that runs sound, media and translation for services and events.</w:t>
-      </w:r>
-    </w:p>
-    <w:p>
-      <w:pPr>
-        <w:pStyle w:val="ListBullet"/>
-        <w:spacing w:after="40"/>
-      </w:pPr>
-      <w:r>
-        <w:t>I set up and run the equipment and help with livestreaming.</w:t>
-      </w:r>
-    </w:p>
-    <w:p>
-      <w:pPr>
-        <w:spacing w:before="120" w:after="0"/>
-      </w:pPr>
-      <w:r>
-        <w:rPr>
-          <w:b/>
-          <w:color w:val="0B3D91"/>
-          <w:sz w:val="21"/>
-        </w:rPr>
-        <w:t>Direct Sales Executive - Airtel Uganda</w:t>
-      </w:r>
-    </w:p>
-    <w:p>
-      <w:pPr>
-        <w:spacing w:after="40"/>
-      </w:pPr>
-      <w:r>
-        <w:rPr>
-          <w:i/>
-          <w:color w:val="555555"/>
-          <w:sz w:val="18"/>
-        </w:rPr>
-        <w:t>2025</w:t>
-      </w:r>
-    </w:p>
-    <w:p>
-      <w:pPr>
-        <w:pStyle w:val="ListBullet"/>
-        <w:spacing w:after="40"/>
-      </w:pPr>
-      <w:r>
-        <w:t>I sold Airtel internet and WiFi packages and followed up with customers.</w:t>
-      </w:r>
-    </w:p>
-    <w:p>
-      <w:pPr>
-        <w:spacing w:before="120" w:after="0"/>
-      </w:pPr>
-      <w:r>
-        <w:rPr>
-          <w:b/>
-          <w:color w:val="0B3D91"/>
-          <w:sz w:val="21"/>
-        </w:rPr>
-        <w:t>Code Instructor (Intern) - Code Academy Uganda</w:t>
-      </w:r>
-    </w:p>
-    <w:p>
-      <w:pPr>
-        <w:spacing w:after="40"/>
-      </w:pPr>
-      <w:r>
-        <w:rPr>
-          <w:i/>
-          <w:color w:val="555555"/>
-          <w:sz w:val="18"/>
-        </w:rPr>
-        <w:t>2025</w:t>
-      </w:r>
-    </w:p>
-    <w:p>
-      <w:pPr>
-        <w:pStyle w:val="ListBullet"/>
-        <w:spacing w:after="40"/>
-      </w:pPr>
-      <w:r>
-        <w:t>I helped students with their coding projects and built their confidence.</w:t>
-      </w:r>
-    </w:p>
-    <w:p>
-      <w:pPr>
-        <w:spacing w:before="120" w:after="0"/>
-      </w:pPr>
-      <w:r>
-        <w:rPr>
-          <w:b/>
-          <w:color w:val="0B3D91"/>
-          <w:sz w:val="21"/>
-        </w:rPr>
-        <w:t>Physics &amp; Mathematics Teacher - Destiny College International</w:t>
-      </w:r>
-    </w:p>
-    <w:p>
-      <w:pPr>
-        <w:spacing w:after="40"/>
-      </w:pPr>
-      <w:r>
-        <w:rPr>
-          <w:i/>
-          <w:color w:val="555555"/>
-          <w:sz w:val="18"/>
-        </w:rPr>
-        <w:t>2025</w:t>
-      </w:r>
-    </w:p>
-    <w:p>
-      <w:pPr>
-        <w:pStyle w:val="ListBullet"/>
-        <w:spacing w:after="40"/>
-      </w:pPr>
-      <w:r>
-        <w:t>I taught Physics and Mathematics and helped students improve their performance.</w:t>
-      </w:r>
-    </w:p>
-    <w:p>
-      <w:pPr>
-        <w:spacing w:before="120" w:after="0"/>
-      </w:pPr>
-      <w:r>
-        <w:rPr>
-          <w:b/>
-          <w:color w:val="0B3D91"/>
-          <w:sz w:val="21"/>
-        </w:rPr>
-        <w:t>Credit Officer - Credit Watch Services International</w:t>
-      </w:r>
-    </w:p>
-    <w:p>
-      <w:pPr>
-        <w:spacing w:after="40"/>
-      </w:pPr>
-      <w:r>
-        <w:rPr>
-          <w:i/>
-          <w:color w:val="555555"/>
-          <w:sz w:val="18"/>
-        </w:rPr>
-        <w:t>2025</w:t>
-      </w:r>
-    </w:p>
-    <w:p>
-      <w:pPr>
-        <w:pStyle w:val="ListBullet"/>
-        <w:spacing w:after="40"/>
-      </w:pPr>
-      <w:r>
-        <w:t>I checked clients' finances and gave them simple financial advice.</w:t>
-      </w:r>
-    </w:p>
-    <w:p>
-      <w:pPr>
-        <w:spacing w:before="120" w:after="0"/>
-      </w:pPr>
-      <w:r>
-        <w:rPr>
-          <w:b/>
-          <w:color w:val="0B3D91"/>
-          <w:sz w:val="21"/>
-        </w:rPr>
-        <w:t>ICT Teacher - Semuto Senior Secondary School</w:t>
-      </w:r>
-    </w:p>
-    <w:p>
-      <w:pPr>
-        <w:spacing w:after="40"/>
-      </w:pPr>
-      <w:r>
-        <w:rPr>
-          <w:i/>
-          <w:color w:val="555555"/>
-          <w:sz w:val="18"/>
-        </w:rPr>
-        <w:t>2024 - 2025</w:t>
-      </w:r>
-    </w:p>
-    <w:p>
-      <w:pPr>
-        <w:pStyle w:val="ListBullet"/>
-        <w:spacing w:after="40"/>
-      </w:pPr>
-      <w:r>
-        <w:t>I taught computer skills and helped students learn practical ICT.</w:t>
-      </w:r>
-    </w:p>
-    <w:p>
-      <w:pPr>
-        <w:spacing w:before="120" w:after="0"/>
-      </w:pPr>
-      <w:r>
-        <w:rPr>
-          <w:b/>
-          <w:color w:val="0B3D91"/>
-          <w:sz w:val="21"/>
-        </w:rPr>
-        <w:t>Marketer - Apex International University</w:t>
-      </w:r>
-    </w:p>
-    <w:p>
-      <w:pPr>
-        <w:spacing w:after="40"/>
-      </w:pPr>
-      <w:r>
-        <w:rPr>
-          <w:i/>
-          <w:color w:val="555555"/>
-          <w:sz w:val="18"/>
-        </w:rPr>
-        <w:t>2023 - 2024</w:t>
-      </w:r>
-    </w:p>
-    <w:p>
-      <w:pPr>
-        <w:pStyle w:val="ListBullet"/>
-        <w:spacing w:after="40"/>
-      </w:pPr>
-      <w:r>
-        <w:t>I did marketing that increased student interest and enrolment.</w:t>
-      </w:r>
-    </w:p>
-    <w:p>
-      <w:pPr>
-        <w:spacing w:before="120" w:after="0"/>
-      </w:pPr>
-      <w:r>
-        <w:rPr>
-          <w:b/>
-          <w:color w:val="0B3D91"/>
-          <w:sz w:val="21"/>
-        </w:rPr>
-        <w:t>Graphics Designer - Magix Graphics</w:t>
-      </w:r>
-    </w:p>
-    <w:p>
-      <w:pPr>
-        <w:spacing w:after="40"/>
-      </w:pPr>
-      <w:r>
-        <w:rPr>
-          <w:i/>
-          <w:color w:val="555555"/>
-          <w:sz w:val="18"/>
-        </w:rPr>
-        <w:t>2022 - 2023</w:t>
-      </w:r>
-    </w:p>
-    <w:p>
-      <w:pPr>
-        <w:pStyle w:val="ListBullet"/>
-        <w:spacing w:after="40"/>
-      </w:pPr>
-      <w:r>
-        <w:t>I designed posters and other materials for clients.</w:t>
-      </w:r>
-    </w:p>
-    <w:p>
-      <w:pPr>
-        <w:spacing w:before="120" w:after="0"/>
-      </w:pPr>
-      <w:r>
-        <w:rPr>
-          <w:b/>
-          <w:color w:val="0B3D91"/>
-          <w:sz w:val="21"/>
-        </w:rPr>
-        <w:t>Sales Promoter - Jajopa International Limited</w:t>
-      </w:r>
-    </w:p>
-    <w:p>
-      <w:pPr>
-        <w:spacing w:after="40"/>
-      </w:pPr>
-      <w:r>
-        <w:rPr>
-          <w:i/>
-          <w:color w:val="555555"/>
-          <w:sz w:val="18"/>
-        </w:rPr>
-        <w:t>2019 - 2021</w:t>
-      </w:r>
-    </w:p>
-    <w:p>
-      <w:pPr>
-        <w:pStyle w:val="ListBullet"/>
-        <w:spacing w:after="40"/>
-      </w:pPr>
-      <w:r>
-        <w:t>I carried out awareness campaigns and distributed products.</w:t>
+        <w:t>Graphic design (Canva), video editing, content creation, sound and media for church services and events.</w:t>
       </w:r>
     </w:p>
     <w:p>
       <w:pPr>
         <w:spacing w:before="200" w:after="80"/>
-        <w:ind w:left="0"/>
-        <w:shd w:val="clear" w:color="auto" w:fill="0B3D91"/>
+        <w:shd w:val="clear" w:color="auto" w:fill="1F3A5F"/>
       </w:pPr>
       <w:r>
         <w:rPr>
@@ -820,317 +554,17 @@
     </w:p>
     <w:p>
       <w:pPr>
-        <w:spacing w:before="80" w:after="20"/>
+        <w:pStyle w:val="ListBullet"/>
+        <w:spacing w:after="40"/>
       </w:pPr>
       <w:r>
         <w:rPr>
           <w:b/>
-          <w:sz w:val="21"/>
         </w:rPr>
-        <w:t>Attendance Hub - Church &amp; Event Attendance (in use)</w:t>
+        <w:t xml:space="preserve">Attendance Hub - Church &amp; Event Attendance (in use): </w:t>
       </w:r>
-    </w:p>
-    <w:p>
-      <w:pPr>
-        <w:pStyle w:val="ListBullet"/>
-        <w:spacing w:after="40"/>
-      </w:pPr>
       <w:r>
-        <w:t>A system that records who attends church services and events, keeps member details and prints reports.</w:t>
-      </w:r>
-    </w:p>
-    <w:p>
-      <w:pPr>
-        <w:pStyle w:val="ListBullet"/>
-        <w:spacing w:after="40"/>
-      </w:pPr>
-      <w:r>
-        <w:t>It is running on a computer, and I also made an Android app version.</w:t>
-      </w:r>
-    </w:p>
-    <w:p>
-      <w:pPr>
-        <w:spacing w:before="80" w:after="20"/>
-      </w:pPr>
-      <w:r>
-        <w:rPr>
-          <w:b/>
-          <w:sz w:val="21"/>
-        </w:rPr>
-        <w:t>School Management System (in use)</w:t>
-      </w:r>
-    </w:p>
-    <w:p>
-      <w:pPr>
-        <w:pStyle w:val="ListBullet"/>
-        <w:spacing w:after="40"/>
-      </w:pPr>
-      <w:r>
-        <w:t>Helps a school manage students, teachers, fees, marks and reports. It works without internet.</w:t>
-      </w:r>
-    </w:p>
-    <w:p>
-      <w:pPr>
-        <w:pStyle w:val="ListBullet"/>
-        <w:spacing w:after="40"/>
-      </w:pPr>
-      <w:r>
-        <w:t>It is installed and used by a school.</w:t>
-      </w:r>
-    </w:p>
-    <w:p>
-      <w:pPr>
-        <w:spacing w:before="80" w:after="20"/>
-      </w:pPr>
-      <w:r>
-        <w:rPr>
-          <w:b/>
-          <w:sz w:val="21"/>
-        </w:rPr>
-        <w:t>Savings Bank SACCO App (in use)</w:t>
-      </w:r>
-    </w:p>
-    <w:p>
-      <w:pPr>
-        <w:pStyle w:val="ListBullet"/>
-        <w:spacing w:after="40"/>
-      </w:pPr>
-      <w:r>
-        <w:t>A simple savings and credit app for SACCO members, made with Flutter.</w:t>
-      </w:r>
-    </w:p>
-    <w:p>
-      <w:pPr>
-        <w:spacing w:before="80" w:after="20"/>
-      </w:pPr>
-      <w:r>
-        <w:rPr>
-          <w:b/>
-          <w:sz w:val="21"/>
-        </w:rPr>
-        <w:t>Church Media &amp; Sound (ongoing)</w:t>
-      </w:r>
-    </w:p>
-    <w:p>
-      <w:pPr>
-        <w:pStyle w:val="ListBullet"/>
-        <w:spacing w:after="40"/>
-      </w:pPr>
-      <w:r>
-        <w:t>I run sound, media and livestreaming for church services and events, and train others to do it.</w:t>
-      </w:r>
-    </w:p>
-    <w:p>
-      <w:pPr>
-        <w:spacing w:before="80" w:after="20"/>
-      </w:pPr>
-      <w:r>
-        <w:rPr>
-          <w:b/>
-          <w:sz w:val="21"/>
-        </w:rPr>
-        <w:t>ClinicSync - Clinic &amp; Pharmacy System (in development)</w:t>
-      </w:r>
-    </w:p>
-    <w:p>
-      <w:pPr>
-        <w:pStyle w:val="ListBullet"/>
-        <w:spacing w:after="40"/>
-      </w:pPr>
-      <w:r>
-        <w:t>A system for clinics and drug shops: sales, stock with expiry dates, daily expenses and end-of-day cash.</w:t>
-      </w:r>
-    </w:p>
-    <w:p>
-      <w:pPr>
-        <w:pStyle w:val="ListBullet"/>
-        <w:spacing w:after="40"/>
-      </w:pPr>
-      <w:r>
-        <w:t>It is still being built and tested, not yet in use.</w:t>
-      </w:r>
-    </w:p>
-    <w:p>
-      <w:pPr>
-        <w:spacing w:before="80" w:after="20"/>
-      </w:pPr>
-      <w:r>
-        <w:rPr>
-          <w:b/>
-          <w:sz w:val="21"/>
-        </w:rPr>
-        <w:t>UCSCU Connect (in development)</w:t>
-      </w:r>
-    </w:p>
-    <w:p>
-      <w:pPr>
-        <w:pStyle w:val="ListBullet"/>
-        <w:spacing w:after="40"/>
-      </w:pPr>
-      <w:r>
-        <w:t>A system being built to help UCSCU with its work. It is still in development and not yet in use.</w:t>
-      </w:r>
-    </w:p>
-    <w:p>
-      <w:pPr>
-        <w:spacing w:before="80" w:after="20"/>
-      </w:pPr>
-      <w:r>
-        <w:rPr>
-          <w:b/>
-          <w:sz w:val="21"/>
-        </w:rPr>
-        <w:t>JD Hub CBS - SACCO Banking System (prototype)</w:t>
-      </w:r>
-    </w:p>
-    <w:p>
-      <w:pPr>
-        <w:pStyle w:val="ListBullet"/>
-        <w:spacing w:after="40"/>
-      </w:pPr>
-      <w:r>
-        <w:t>A banking-style system for SACCOs, built as a prototype to learn how core banking works.</w:t>
-      </w:r>
-    </w:p>
-    <w:p>
-      <w:pPr>
-        <w:spacing w:before="80" w:after="20"/>
-      </w:pPr>
-      <w:r>
-        <w:rPr>
-          <w:b/>
-          <w:sz w:val="21"/>
-        </w:rPr>
-        <w:t>MyMarket.ug - Online Market (in development)</w:t>
-      </w:r>
-    </w:p>
-    <w:p>
-      <w:pPr>
-        <w:pStyle w:val="ListBullet"/>
-        <w:spacing w:after="40"/>
-      </w:pPr>
-      <w:r>
-        <w:t>An online market where vendors can show their goods and customers can pay by mobile money. Still being finished.</w:t>
-      </w:r>
-    </w:p>
-    <w:p>
-      <w:pPr>
-        <w:spacing w:before="80" w:after="20"/>
-      </w:pPr>
-      <w:r>
-        <w:rPr>
-          <w:b/>
-          <w:sz w:val="21"/>
-        </w:rPr>
-        <w:t>BizDocs - Invoices for Small Businesses (in development)</w:t>
-      </w:r>
-    </w:p>
-    <w:p>
-      <w:pPr>
-        <w:pStyle w:val="ListBullet"/>
-        <w:spacing w:after="40"/>
-      </w:pPr>
-      <w:r>
-        <w:t>An app for making invoices, receipts and quotations for small businesses. Still being built.</w:t>
-      </w:r>
-    </w:p>
-    <w:p>
-      <w:pPr>
-        <w:spacing w:before="80" w:after="20"/>
-      </w:pPr>
-      <w:r>
-        <w:rPr>
-          <w:b/>
-          <w:sz w:val="21"/>
-        </w:rPr>
-        <w:t>Kids AI Studio (prototype)</w:t>
-      </w:r>
-    </w:p>
-    <w:p>
-      <w:pPr>
-        <w:pStyle w:val="ListBullet"/>
-        <w:spacing w:after="40"/>
-      </w:pPr>
-      <w:r>
-        <w:t>A fun project that turns one sentence into a short children's video or song using AI.</w:t>
-      </w:r>
-    </w:p>
-    <w:p>
-      <w:pPr>
-        <w:spacing w:before="80" w:after="20"/>
-      </w:pPr>
-      <w:r>
-        <w:rPr>
-          <w:b/>
-          <w:sz w:val="21"/>
-        </w:rPr>
-        <w:t>MT5 Trading Bot (prototype)</w:t>
-      </w:r>
-    </w:p>
-    <w:p>
-      <w:pPr>
-        <w:pStyle w:val="ListBullet"/>
-        <w:spacing w:after="40"/>
-      </w:pPr>
-      <w:r>
-        <w:t>A practice bot I built to learn about trading, money and risk.</w:t>
-      </w:r>
-    </w:p>
-    <w:p>
-      <w:pPr>
-        <w:spacing w:before="80" w:after="20"/>
-      </w:pPr>
-      <w:r>
-        <w:rPr>
-          <w:b/>
-          <w:sz w:val="21"/>
-        </w:rPr>
-        <w:t>KJ Chat App (prototype)</w:t>
-      </w:r>
-    </w:p>
-    <w:p>
-      <w:pPr>
-        <w:pStyle w:val="ListBullet"/>
-        <w:spacing w:after="40"/>
-      </w:pPr>
-      <w:r>
-        <w:t>A chat app I built to learn how messaging apps work.</w:t>
-      </w:r>
-    </w:p>
-    <w:p>
-      <w:pPr>
-        <w:spacing w:before="80" w:after="20"/>
-      </w:pPr>
-      <w:r>
-        <w:rPr>
-          <w:b/>
-          <w:sz w:val="21"/>
-        </w:rPr>
-        <w:t>JD Hub Website (in development)</w:t>
-      </w:r>
-    </w:p>
-    <w:p>
-      <w:pPr>
-        <w:pStyle w:val="ListBullet"/>
-        <w:spacing w:after="40"/>
-      </w:pPr>
-      <w:r>
-        <w:t>The website for my business, Jordan Design Hub.</w:t>
-      </w:r>
-    </w:p>
-    <w:p>
-      <w:pPr>
-        <w:spacing w:before="200" w:after="80"/>
-        <w:ind w:left="0"/>
-        <w:shd w:val="clear" w:color="auto" w:fill="0B3D91"/>
-      </w:pPr>
-      <w:r>
-        <w:rPr>
-          <w:b/>
-          <w:color w:val="FFFFFF"/>
-          <w:sz w:val="21"/>
-        </w:rPr>
-        <w:t xml:space="preserve">  LEADERSHIP &amp; VOLUNTEER ROLES</w:t>
+        <w:t>Records church and event attendance, keeps member details and prints reports. Running on a computer, with an Android app version.</w:t>
       </w:r>
     </w:p>
     <w:p>
@@ -1142,10 +576,10 @@
         <w:rPr>
           <w:b/>
         </w:rPr>
-        <w:t xml:space="preserve">Founder &amp; Chairperson - Apex Christian Union (2023 - 2025): </w:t>
+        <w:t xml:space="preserve">School Management System (in use): </w:t>
       </w:r>
       <w:r>
-        <w:t>I started the Christian Union at my university and led it, organising outreaches and events.</w:t>
+        <w:t>Helps a school manage students, teachers, fees, marks and reports, and works without internet.</w:t>
       </w:r>
     </w:p>
     <w:p>
@@ -1157,10 +591,10 @@
         <w:rPr>
           <w:b/>
         </w:rPr>
-        <w:t xml:space="preserve">GRC - IT Faculty, Apex International University (2023 - 2024): </w:t>
+        <w:t xml:space="preserve">Savings Bank SACCO App (in use): </w:t>
       </w:r>
       <w:r>
-        <w:t>I represented students and helped with faculty activities.</w:t>
+        <w:t>A simple savings and credit app for SACCO members, made with Flutter.</w:t>
       </w:r>
     </w:p>
     <w:p>
@@ -1172,25 +606,10 @@
         <w:rPr>
           <w:b/>
         </w:rPr>
-        <w:t xml:space="preserve">Team Lead - Media &amp; Technical Operations (2024 - Present): </w:t>
+        <w:t xml:space="preserve">Church Media &amp; Sound (ongoing): </w:t>
       </w:r>
       <w:r>
-        <w:t>I lead the media and sound team at church.</w:t>
-      </w:r>
-    </w:p>
-    <w:p>
-      <w:pPr>
-        <w:spacing w:before="200" w:after="80"/>
-        <w:ind w:left="0"/>
-        <w:shd w:val="clear" w:color="auto" w:fill="0B3D91"/>
-      </w:pPr>
-      <w:r>
-        <w:rPr>
-          <w:b/>
-          <w:color w:val="FFFFFF"/>
-          <w:sz w:val="21"/>
-        </w:rPr>
-        <w:t xml:space="preserve">  EDUCATION &amp; TRAINING</w:t>
+        <w:t>Running sound, media and livestreaming for church services and events, and training others to do it.</w:t>
       </w:r>
     </w:p>
     <w:p>
@@ -1202,10 +621,10 @@
         <w:rPr>
           <w:b/>
         </w:rPr>
-        <w:t xml:space="preserve">Bachelor of Science in Information Technology - </w:t>
+        <w:t xml:space="preserve">ClinicSync - Clinic &amp; Pharmacy System (in development): </w:t>
       </w:r>
       <w:r>
-        <w:t>Apex International University  |  Graduated 2026</w:t>
+        <w:t>A system for clinics and drug shops covering sales, stock with expiry dates, daily expenses and end-of-day cash. Still being built and tested.</w:t>
       </w:r>
     </w:p>
     <w:p>
@@ -1217,10 +636,10 @@
         <w:rPr>
           <w:b/>
         </w:rPr>
-        <w:t xml:space="preserve">Certificate in Theology - </w:t>
+        <w:t xml:space="preserve">UCSCU Connect (in development): </w:t>
       </w:r>
       <w:r>
-        <w:t>In progress  |  Currently studying</w:t>
+        <w:t>A system being built to help UCSCU with its work. Still in development.</w:t>
       </w:r>
     </w:p>
     <w:p>
@@ -1232,10 +651,10 @@
         <w:rPr>
           <w:b/>
         </w:rPr>
-        <w:t xml:space="preserve">Uganda Advanced Certificate of Education (UACE) - </w:t>
+        <w:t xml:space="preserve">JD Hub CBS - SACCO Banking System (prototype): </w:t>
       </w:r>
       <w:r>
-        <w:t>Mbale Secondary School  |  2019 - 2020</w:t>
+        <w:t>A banking-style system for SACCOs, built as a prototype to learn how core banking works.</w:t>
       </w:r>
     </w:p>
     <w:p>
@@ -1247,10 +666,10 @@
         <w:rPr>
           <w:b/>
         </w:rPr>
-        <w:t xml:space="preserve">Uganda Certificate of Education (UCE) - </w:t>
+        <w:t xml:space="preserve">MyMarket.ug - Online Market (in development): </w:t>
       </w:r>
       <w:r>
-        <w:t>Lugazi Homestone Boarding School  |  2015 - 2018</w:t>
+        <w:t>An online market where vendors can show their goods and customers can pay by mobile money. Still being finished.</w:t>
       </w:r>
     </w:p>
     <w:p>
@@ -1262,17 +681,245 @@
         <w:rPr>
           <w:b/>
         </w:rPr>
-        <w:t xml:space="preserve">Primary Leaving Examination (PLE) - </w:t>
+        <w:t xml:space="preserve">BizDocs - Invoices for Small Businesses (in development): </w:t>
       </w:r>
       <w:r>
-        <w:t>Namakwekwe Primary School  |  2008 - 2014</w:t>
+        <w:t>An app for making invoices, receipts and quotations for small businesses. Still being built.</w:t>
+      </w:r>
+    </w:p>
+    <w:p>
+      <w:pPr>
+        <w:pStyle w:val="ListBullet"/>
+        <w:spacing w:after="40"/>
+      </w:pPr>
+      <w:r>
+        <w:rPr>
+          <w:b/>
+        </w:rPr>
+        <w:t xml:space="preserve">Kids AI Studio (prototype): </w:t>
+      </w:r>
+      <w:r>
+        <w:t>Turns one sentence into a short children's video or song using AI.</w:t>
+      </w:r>
+    </w:p>
+    <w:p>
+      <w:pPr>
+        <w:pStyle w:val="ListBullet"/>
+        <w:spacing w:after="40"/>
+      </w:pPr>
+      <w:r>
+        <w:rPr>
+          <w:b/>
+        </w:rPr>
+        <w:t xml:space="preserve">MT5 Trading Bot (prototype): </w:t>
+      </w:r>
+      <w:r>
+        <w:t>A practice bot built to learn about trading, money and risk.</w:t>
+      </w:r>
+    </w:p>
+    <w:p>
+      <w:pPr>
+        <w:pStyle w:val="ListBullet"/>
+        <w:spacing w:after="40"/>
+      </w:pPr>
+      <w:r>
+        <w:rPr>
+          <w:b/>
+        </w:rPr>
+        <w:t xml:space="preserve">KJ Chat App (prototype): </w:t>
+      </w:r>
+      <w:r>
+        <w:t>A chat app built to learn how messaging apps work.</w:t>
+      </w:r>
+    </w:p>
+    <w:p>
+      <w:pPr>
+        <w:pStyle w:val="ListBullet"/>
+        <w:spacing w:after="40"/>
+      </w:pPr>
+      <w:r>
+        <w:rPr>
+          <w:b/>
+        </w:rPr>
+        <w:t xml:space="preserve">JD Hub Website (in development): </w:t>
+      </w:r>
+      <w:r>
+        <w:t>The website for Jordan Design Hub.</w:t>
       </w:r>
     </w:p>
     <w:p>
       <w:pPr>
         <w:spacing w:before="200" w:after="80"/>
-        <w:ind w:left="0"/>
-        <w:shd w:val="clear" w:color="auto" w:fill="0B3D91"/>
+        <w:shd w:val="clear" w:color="auto" w:fill="1F3A5F"/>
+      </w:pPr>
+      <w:r>
+        <w:rPr>
+          <w:b/>
+          <w:color w:val="FFFFFF"/>
+          <w:sz w:val="21"/>
+        </w:rPr>
+        <w:t xml:space="preserve">  ADDITIONAL ROLES</w:t>
+      </w:r>
+    </w:p>
+    <w:p>
+      <w:pPr>
+        <w:spacing w:before="80" w:after="0"/>
+      </w:pPr>
+      <w:r>
+        <w:rPr>
+          <w:b/>
+          <w:color w:val="1F3A5F"/>
+          <w:sz w:val="21"/>
+        </w:rPr>
+        <w:t>Team Lead - Media &amp; Technical Operations (2024 - Present)</w:t>
+      </w:r>
+    </w:p>
+    <w:p>
+      <w:pPr>
+        <w:spacing w:after="40"/>
+        <w:ind w:left="120"/>
+      </w:pPr>
+      <w:r>
+        <w:t>Oversaw translation services, sound systems, and media production. Managed technical setups for communication and public engagement.</w:t>
+      </w:r>
+    </w:p>
+    <w:p>
+      <w:pPr>
+        <w:spacing w:before="80" w:after="0"/>
+      </w:pPr>
+      <w:r>
+        <w:rPr>
+          <w:b/>
+          <w:color w:val="1F3A5F"/>
+          <w:sz w:val="21"/>
+        </w:rPr>
+        <w:t>Founder &amp; Chairperson - Apex Christian Union (2023 - 2025)</w:t>
+      </w:r>
+    </w:p>
+    <w:p>
+      <w:pPr>
+        <w:spacing w:after="40"/>
+        <w:ind w:left="120"/>
+      </w:pPr>
+      <w:r>
+        <w:t>Established a Christian Union fostering spiritual growth, collaboration and mentorship among students. Organized large-scale events like outreaches to enhance spiritual and educational engagement.</w:t>
+      </w:r>
+    </w:p>
+    <w:p>
+      <w:pPr>
+        <w:spacing w:before="80" w:after="0"/>
+      </w:pPr>
+      <w:r>
+        <w:rPr>
+          <w:b/>
+          <w:color w:val="1F3A5F"/>
+          <w:sz w:val="21"/>
+        </w:rPr>
+        <w:t>GRC - IT Faculty, Apex International University (2023 - 2024)</w:t>
+      </w:r>
+    </w:p>
+    <w:p>
+      <w:pPr>
+        <w:spacing w:after="40"/>
+        <w:ind w:left="120"/>
+      </w:pPr>
+      <w:r>
+        <w:t>Represented student interests and facilitated IT faculty initiatives. Advocated for student needs and strengthened academic collaboration.</w:t>
+      </w:r>
+    </w:p>
+    <w:p>
+      <w:pPr>
+        <w:spacing w:before="200" w:after="80"/>
+        <w:shd w:val="clear" w:color="auto" w:fill="1F3A5F"/>
+      </w:pPr>
+      <w:r>
+        <w:rPr>
+          <w:b/>
+          <w:color w:val="FFFFFF"/>
+          <w:sz w:val="21"/>
+        </w:rPr>
+        <w:t xml:space="preserve">  EDUCATION</w:t>
+      </w:r>
+    </w:p>
+    <w:p>
+      <w:pPr>
+        <w:pStyle w:val="ListBullet"/>
+        <w:spacing w:after="40"/>
+      </w:pPr>
+      <w:r>
+        <w:rPr>
+          <w:b/>
+        </w:rPr>
+        <w:t xml:space="preserve">Apex International University: </w:t>
+      </w:r>
+      <w:r>
+        <w:t>Bachelor's Degree in Information Technology - Graduated 2026</w:t>
+      </w:r>
+    </w:p>
+    <w:p>
+      <w:pPr>
+        <w:pStyle w:val="ListBullet"/>
+        <w:spacing w:after="40"/>
+      </w:pPr>
+      <w:r>
+        <w:rPr>
+          <w:b/>
+        </w:rPr>
+        <w:t xml:space="preserve">Certificate in Theology: </w:t>
+      </w:r>
+      <w:r>
+        <w:t>In progress</w:t>
+      </w:r>
+    </w:p>
+    <w:p>
+      <w:pPr>
+        <w:pStyle w:val="ListBullet"/>
+        <w:spacing w:after="40"/>
+      </w:pPr>
+      <w:r>
+        <w:rPr>
+          <w:b/>
+        </w:rPr>
+        <w:t xml:space="preserve">Mbale Secondary School: </w:t>
+      </w:r>
+      <w:r>
+        <w:t>Uganda Advanced Certificate of Education (2019 - 2020)</w:t>
+      </w:r>
+    </w:p>
+    <w:p>
+      <w:pPr>
+        <w:pStyle w:val="ListBullet"/>
+        <w:spacing w:after="40"/>
+      </w:pPr>
+      <w:r>
+        <w:rPr>
+          <w:b/>
+        </w:rPr>
+        <w:t xml:space="preserve">Lugazi Homestone Boarding School: </w:t>
+      </w:r>
+      <w:r>
+        <w:t>Uganda Certificate of Education (2015 - 2018)</w:t>
+      </w:r>
+    </w:p>
+    <w:p>
+      <w:pPr>
+        <w:pStyle w:val="ListBullet"/>
+        <w:spacing w:after="40"/>
+      </w:pPr>
+      <w:r>
+        <w:rPr>
+          <w:b/>
+        </w:rPr>
+        <w:t xml:space="preserve">Namakwekwe Primary School: </w:t>
+      </w:r>
+      <w:r>
+        <w:t>Primary Leaving Examination (2008 - 2014)</w:t>
+      </w:r>
+    </w:p>
+    <w:p>
+      <w:pPr>
+        <w:spacing w:before="200" w:after="80"/>
+        <w:shd w:val="clear" w:color="auto" w:fill="1F3A5F"/>
       </w:pPr>
       <w:r>
         <w:rPr>
@@ -1289,7 +936,7 @@
         <w:spacing w:after="40"/>
       </w:pPr>
       <w:r>
-        <w:t>Graphic design with Canva - posters, logos and branding</w:t>
+        <w:t>Graphic design with Canva - posters, logos and branding.</w:t>
       </w:r>
     </w:p>
     <w:p>
@@ -1298,7 +945,7 @@
         <w:spacing w:after="40"/>
       </w:pPr>
       <w:r>
-        <w:t>Video editing and content creation</w:t>
+        <w:t>Video editing and content creation.</w:t>
       </w:r>
     </w:p>
     <w:p>
@@ -1307,7 +954,7 @@
         <w:spacing w:after="40"/>
       </w:pPr>
       <w:r>
-        <w:t>Church media, sound systems and livestreaming</w:t>
+        <w:t>Church media, sound systems and livestreaming.</w:t>
       </w:r>
     </w:p>
     <w:p>
@@ -1316,7 +963,7 @@
         <w:spacing w:after="40"/>
       </w:pPr>
       <w:r>
-        <w:t>AI tools (OpenHands) and how to build and use AI agents</w:t>
+        <w:t>AI tools (OpenHands) and how to build and use AI agents.</w:t>
       </w:r>
     </w:p>
     <w:p>
@@ -1325,7 +972,7 @@
         <w:spacing w:after="40"/>
       </w:pPr>
       <w:r>
-        <w:t>Building websites and simple apps by working on real projects</w:t>
+        <w:t>Building websites and simple apps by working on real projects.</w:t>
       </w:r>
     </w:p>
     <w:p>
@@ -1334,14 +981,13 @@
         <w:spacing w:after="40"/>
       </w:pPr>
       <w:r>
-        <w:t>Teaching and helping other people learn computer skills</w:t>
+        <w:t>Teaching and helping others learn computer skills.</w:t>
       </w:r>
     </w:p>
     <w:p>
       <w:pPr>
         <w:spacing w:before="200" w:after="80"/>
-        <w:ind w:left="0"/>
-        <w:shd w:val="clear" w:color="auto" w:fill="0B3D91"/>
+        <w:shd w:val="clear" w:color="auto" w:fill="1F3A5F"/>
       </w:pPr>
       <w:r>
         <w:rPr>
@@ -1358,7 +1004,7 @@
         <w:spacing w:after="40"/>
       </w:pPr>
       <w:r>
-        <w:t>English - excellent (speaking, reading, writing)</w:t>
+        <w:t>English: Excellent (Speaking, Reading, Writing)</w:t>
       </w:r>
     </w:p>
     <w:p>
@@ -1367,7 +1013,7 @@
         <w:spacing w:after="40"/>
       </w:pPr>
       <w:r>
-        <w:t>Luganda - very good (reading); good (speaking, writing)</w:t>
+        <w:t>Luganda: Very Good (Reading), Good (Speaking, Writing)</w:t>
       </w:r>
     </w:p>
     <w:p>
@@ -1376,14 +1022,13 @@
         <w:spacing w:after="40"/>
       </w:pPr>
       <w:r>
-        <w:t>Lumasaba - excellent (speaking); very good (reading); good (writing)</w:t>
+        <w:t>Lumasaba: Excellent (Speaking), Very Good (Reading), Good (Writing)</w:t>
       </w:r>
     </w:p>
     <w:p>
       <w:pPr>
         <w:spacing w:before="200" w:after="80"/>
-        <w:ind w:left="0"/>
-        <w:shd w:val="clear" w:color="auto" w:fill="0B3D91"/>
+        <w:shd w:val="clear" w:color="auto" w:fill="1F3A5F"/>
       </w:pPr>
       <w:r>
         <w:rPr>
@@ -1400,7 +1045,10 @@
         <w:spacing w:after="40"/>
       </w:pPr>
       <w:r>
-        <w:t>Nangede Jacqueline - Director, Jajopa International Limited - 0781 934 093</w:t>
+        <w:t xml:space="preserve">Nangede Jacqueline - Director, Jajopa International Limited - </w:t>
+      </w:r>
+      <w:r>
+        <w:t>0781 934 093</w:t>
       </w:r>
     </w:p>
     <w:p>
@@ -1409,7 +1057,10 @@
         <w:spacing w:after="40"/>
       </w:pPr>
       <w:r>
-        <w:t>Emmanuel Buyi - Wallace Engineering Services - 0753 190 857</w:t>
+        <w:t xml:space="preserve">Emmanuel Buyi - Wallace Engineering Services - </w:t>
+      </w:r>
+      <w:r>
+        <w:t>0753 190 857</w:t>
       </w:r>
     </w:p>
     <w:p>
@@ -1418,12 +1069,15 @@
         <w:spacing w:after="40"/>
       </w:pPr>
       <w:r>
-        <w:t>Mr. Nsereko Elisha - Dean of Students, Apex International University - +256 760 749 685</w:t>
+        <w:t xml:space="preserve">Mr. Nsereko Elisha - Dean of Students, Apex International University - </w:t>
+      </w:r>
+      <w:r>
+        <w:t>+256 760 749 685</w:t>
       </w:r>
     </w:p>
     <w:sectPr>
       <w:pgSz w:w="12240" w:h="15840"/>
-      <w:pgMar w:top="648" w:right="792" w:bottom="648" w:left="792" w:header="720" w:footer="720" w:gutter="0"/>
+      <w:pgMar w:top="720" w:right="864" w:bottom="720" w:left="864" w:header="720" w:footer="720" w:gutter="0"/>
       <w:cols w:space="720"/>
       <w:docGrid w:linePitch="360"/>
     </w:sectPr>

</xml_diff>